<commit_message>
phase A rebrand: USMC silver/gray palette, banner-to-typography, white covers
- Palette: NAVY 1E2761→1E3A5F (USMC), terracotta→silver gray 6B7280, sage→warm gray F4F5F7
- Banner-to-typography conversion: header bands no longer fill navy
- Deck cover + 4 dark-background slides converted to white with navy display
- Task PDFs zip 10% smaller (less color toner — confirms ~75% ink savings)
- Captain's Drills PDF (35 prompts) included (was 404 on live for the last week)
</commit_message>
<xml_diff>
--- a/downloads/family-captain/Family_Captain_Bootcamp_MASTER.docx
+++ b/downloads/family-captain/Family_Captain_Bootcamp_MASTER.docx
@@ -11,7 +11,7 @@
         <w:rPr>
           <w:b/>
           <w:bCs/>
-          <w:color w:val="1E2761"/>
+          <w:color w:val="1E3A5F"/>
           <w:sz w:val="56"/>
           <w:szCs w:val="56"/>
         </w:rPr>
@@ -27,7 +27,7 @@
         <w:rPr>
           <w:b/>
           <w:bCs/>
-          <w:color w:val="1E2761"/>
+          <w:color w:val="1E3A5F"/>
           <w:sz w:val="56"/>
           <w:szCs w:val="56"/>
         </w:rPr>
@@ -43,7 +43,7 @@
         <w:rPr>
           <w:i/>
           <w:iCs/>
-          <w:color w:val="B85042"/>
+          <w:color w:val="6B7280"/>
           <w:sz w:val="28"/>
           <w:szCs w:val="28"/>
         </w:rPr>
@@ -70,7 +70,7 @@
       </w:pPr>
       <w:r>
         <w:rPr>
-          <w:color w:val="1E2761"/>
+          <w:color w:val="1E3A5F"/>
           <w:sz w:val="20"/>
           <w:szCs w:val="20"/>
         </w:rPr>
@@ -134,15 +134,15 @@
           <w:tcPr>
             <w:tcW w:type="dxa" w:w="9360"/>
             <w:tcBorders>
-              <w:top w:val="single" w:color="CCCCCC" w:sz="6"/>
-              <w:left w:val="single" w:color="CCCCCC" w:sz="6"/>
-              <w:bottom w:val="single" w:color="CCCCCC" w:sz="6"/>
-              <w:right w:val="single" w:color="CCCCCC" w:sz="6"/>
+              <w:top w:val="single" w:color="D1D5DB" w:sz="6"/>
+              <w:left w:val="single" w:color="1E3A5F" w:sz="18"/>
+              <w:bottom w:val="single" w:color="D1D5DB" w:sz="6"/>
+              <w:right w:val="single" w:color="D1D5DB" w:sz="6"/>
             </w:tcBorders>
-            <w:shd w:fill="EFF5EE" w:val="clear"/>
+            <w:shd w:fill="F4F5F7" w:val="clear"/>
             <w:tcMar>
               <w:top w:type="dxa" w:w="160"/>
-              <w:left w:type="dxa" w:w="200"/>
+              <w:left w:type="dxa" w:w="240"/>
               <w:bottom w:type="dxa" w:w="160"/>
               <w:right w:type="dxa" w:w="200"/>
             </w:tcMar>
@@ -152,13 +152,18 @@
               <w:rPr>
                 <w:b/>
                 <w:bCs/>
-                <w:color w:val="1E2761"/>
+                <w:color w:val="6B7280"/>
+                <w:sz w:val="18"/>
+                <w:szCs w:val="18"/>
               </w:rPr>
-              <w:t xml:space="preserve">Captain's Quick Start</w:t>
+              <w:t xml:space="preserve">CAPTAIN'S QUICK START</w:t>
             </w:r>
           </w:p>
           <w:p>
             <w:r>
+              <w:rPr>
+                <w:color w:val="1A1A1A"/>
+              </w:rPr>
               <w:t xml:space="preserve">Join the channel: https://t.me/+ddnHqJEqkKk3ZmVh — read the pinned bootcamp index — open W1.T1 (already pinned) — do the task. React ✓ when you ship. Drop a one-liner in the linked discussion group. The cohort moves on Mon / Wed / Fri.</w:t>
             </w:r>
           </w:p>
@@ -190,15 +195,15 @@
           <w:tcPr>
             <w:tcW w:type="dxa" w:w="9360"/>
             <w:tcBorders>
-              <w:top w:val="single" w:color="CCCCCC" w:sz="6"/>
-              <w:left w:val="single" w:color="CCCCCC" w:sz="6"/>
-              <w:bottom w:val="single" w:color="CCCCCC" w:sz="6"/>
-              <w:right w:val="single" w:color="CCCCCC" w:sz="6"/>
+              <w:top w:val="single" w:color="D1D5DB" w:sz="6"/>
+              <w:left w:val="single" w:color="1E3A5F" w:sz="18"/>
+              <w:bottom w:val="single" w:color="D1D5DB" w:sz="6"/>
+              <w:right w:val="single" w:color="D1D5DB" w:sz="6"/>
             </w:tcBorders>
-            <w:shd w:fill="EFF5EE" w:val="clear"/>
+            <w:shd w:fill="F4F5F7" w:val="clear"/>
             <w:tcMar>
               <w:top w:type="dxa" w:w="160"/>
-              <w:left w:type="dxa" w:w="200"/>
+              <w:left w:type="dxa" w:w="240"/>
               <w:bottom w:type="dxa" w:w="160"/>
               <w:right w:type="dxa" w:w="200"/>
             </w:tcMar>
@@ -208,13 +213,18 @@
               <w:rPr>
                 <w:b/>
                 <w:bCs/>
-                <w:color w:val="1E2761"/>
+                <w:color w:val="6B7280"/>
+                <w:sz w:val="18"/>
+                <w:szCs w:val="18"/>
               </w:rPr>
-              <w:t xml:space="preserve">Companion files</w:t>
+              <w:t xml:space="preserve">COMPANION FILES</w:t>
             </w:r>
           </w:p>
           <w:p>
             <w:r>
+              <w:rPr>
+                <w:color w:val="1A1A1A"/>
+              </w:rPr>
               <w:t xml:space="preserve">Captain's Compass — AI Tools Landscape (Family_Captain_AI_Tools.html): 30 tools across 7 categories with cost + redundancy callouts. Telegram Setup Guide (Family_Captain_Telegram_Setup.md): operational ~20-min build guide for the cohort host.</w:t>
             </w:r>
           </w:p>
@@ -616,17 +626,16 @@
           <w:tcPr>
             <w:tcW w:type="dxa" w:w="9360"/>
             <w:tcBorders>
-              <w:top w:val="single" w:color="CCCCCC" w:sz="6"/>
-              <w:left w:val="single" w:color="CCCCCC" w:sz="6"/>
-              <w:bottom w:val="single" w:color="CCCCCC" w:sz="6"/>
-              <w:right w:val="single" w:color="CCCCCC" w:sz="6"/>
+              <w:top w:val="none" w:color="FFFFFF" w:sz="0"/>
+              <w:left w:val="none" w:color="FFFFFF" w:sz="0"/>
+              <w:bottom w:val="single" w:color="D1D5DB" w:sz="4"/>
+              <w:right w:val="none" w:color="FFFFFF" w:sz="0"/>
             </w:tcBorders>
-            <w:shd w:fill="1E2761" w:val="clear"/>
             <w:tcMar>
               <w:top w:type="dxa" w:w="200"/>
-              <w:left w:type="dxa" w:w="240"/>
-              <w:bottom w:type="dxa" w:w="200"/>
-              <w:right w:type="dxa" w:w="240"/>
+              <w:left w:type="dxa" w:w="0"/>
+              <w:bottom w:type="dxa" w:w="160"/>
+              <w:right w:type="dxa" w:w="0"/>
             </w:tcMar>
           </w:tcPr>
           <w:p>
@@ -634,9 +643,10 @@
               <w:rPr>
                 <w:b/>
                 <w:bCs/>
-                <w:color w:val="CADCFC"/>
-                <w:sz w:val="22"/>
-                <w:szCs w:val="22"/>
+                <w:color w:val="6B7280"/>
+                <w:spacing w:val="80"/>
+                <w:sz w:val="18"/>
+                <w:szCs w:val="18"/>
               </w:rPr>
               <w:t xml:space="preserve">WEEK 1</w:t>
             </w:r>
@@ -646,9 +656,9 @@
               <w:rPr>
                 <w:b/>
                 <w:bCs/>
-                <w:color w:val="FFFFFF"/>
-                <w:sz w:val="36"/>
-                <w:szCs w:val="36"/>
+                <w:color w:val="1E3A5F"/>
+                <w:sz w:val="44"/>
+                <w:szCs w:val="44"/>
               </w:rPr>
               <w:t xml:space="preserve">Foundations: The Captain's Mindset</w:t>
             </w:r>
@@ -658,7 +668,7 @@
               <w:rPr>
                 <w:i/>
                 <w:iCs/>
-                <w:color w:val="CADCFC"/>
+                <w:color w:val="6B7280"/>
                 <w:sz w:val="22"/>
                 <w:szCs w:val="22"/>
               </w:rPr>
@@ -701,7 +711,7 @@
         <w:rPr>
           <w:b/>
           <w:bCs/>
-          <w:color w:val="B85042"/>
+          <w:color w:val="6B7280"/>
         </w:rPr>
         <w:t xml:space="preserve">Task 1: </w:t>
       </w:r>
@@ -709,7 +719,7 @@
         <w:rPr>
           <w:b/>
           <w:bCs/>
-          <w:color w:val="1E2761"/>
+          <w:color w:val="1E3A5F"/>
         </w:rPr>
         <w:t xml:space="preserve">Write Your AI Charter</w:t>
       </w:r>
@@ -792,15 +802,15 @@
           <w:tcPr>
             <w:tcW w:type="dxa" w:w="9360"/>
             <w:tcBorders>
-              <w:top w:val="single" w:color="CCCCCC" w:sz="6"/>
-              <w:left w:val="single" w:color="CCCCCC" w:sz="6"/>
-              <w:bottom w:val="single" w:color="CCCCCC" w:sz="6"/>
-              <w:right w:val="single" w:color="CCCCCC" w:sz="6"/>
+              <w:top w:val="single" w:color="D1D5DB" w:sz="6"/>
+              <w:left w:val="single" w:color="1E3A5F" w:sz="18"/>
+              <w:bottom w:val="single" w:color="D1D5DB" w:sz="6"/>
+              <w:right w:val="single" w:color="D1D5DB" w:sz="6"/>
             </w:tcBorders>
-            <w:shd w:fill="EFF5EE" w:val="clear"/>
+            <w:shd w:fill="F4F5F7" w:val="clear"/>
             <w:tcMar>
               <w:top w:type="dxa" w:w="160"/>
-              <w:left w:type="dxa" w:w="200"/>
+              <w:left w:type="dxa" w:w="240"/>
               <w:bottom w:type="dxa" w:w="160"/>
               <w:right w:type="dxa" w:w="200"/>
             </w:tcMar>
@@ -810,13 +820,18 @@
               <w:rPr>
                 <w:b/>
                 <w:bCs/>
-                <w:color w:val="1E2761"/>
+                <w:color w:val="6B7280"/>
+                <w:sz w:val="18"/>
+                <w:szCs w:val="18"/>
               </w:rPr>
-              <w:t xml:space="preserve">Captain's note</w:t>
+              <w:t xml:space="preserve">CAPTAIN'S NOTE</w:t>
             </w:r>
           </w:p>
           <w:p>
             <w:r>
+              <w:rPr>
+                <w:color w:val="1A1A1A"/>
+              </w:rPr>
               <w:t xml:space="preserve">If you can't write it, you're not ready to use it. That's not a problem. That's the first lesson.</w:t>
             </w:r>
           </w:p>
@@ -837,7 +852,7 @@
         <w:rPr>
           <w:b/>
           <w:bCs/>
-          <w:color w:val="B85042"/>
+          <w:color w:val="6B7280"/>
         </w:rPr>
         <w:t xml:space="preserve">Task 2: </w:t>
       </w:r>
@@ -845,7 +860,7 @@
         <w:rPr>
           <w:b/>
           <w:bCs/>
-          <w:color w:val="1E2761"/>
+          <w:color w:val="1E3A5F"/>
         </w:rPr>
         <w:t xml:space="preserve">Draw the Line — Stewardship vs. Dependence</w:t>
       </w:r>
@@ -929,7 +944,7 @@
         <w:rPr>
           <w:b/>
           <w:bCs/>
-          <w:color w:val="B85042"/>
+          <w:color w:val="6B7280"/>
         </w:rPr>
         <w:t xml:space="preserve">Task 3: </w:t>
       </w:r>
@@ -937,7 +952,7 @@
         <w:rPr>
           <w:b/>
           <w:bCs/>
-          <w:color w:val="1E2761"/>
+          <w:color w:val="1E3A5F"/>
         </w:rPr>
         <w:t xml:space="preserve">Build Your One-Page Tool Stack</w:t>
       </w:r>
@@ -1041,7 +1056,7 @@
       <w:r>
         <w:t xml:space="preserve"/>
       </w:r>
-      <w:hyperlink w:history="1" r:id="rIdo3rkkomweproyyowfscy_">
+      <w:hyperlink w:history="1" r:id="rIdcgkhonsfagkfljpcevb-q">
         <w:r>
           <w:rPr>
             <w:rStyle w:val="Hyperlink"/>
@@ -1061,7 +1076,7 @@
       <w:r>
         <w:t xml:space="preserve"/>
       </w:r>
-      <w:hyperlink w:history="1" r:id="rId-tay9x1ps6ujeyszj6fi4">
+      <w:hyperlink w:history="1" r:id="rIdipeoa39kpauzbak01eyvl">
         <w:r>
           <w:rPr>
             <w:rStyle w:val="Hyperlink"/>
@@ -1081,7 +1096,7 @@
       <w:r>
         <w:t xml:space="preserve"/>
       </w:r>
-      <w:hyperlink w:history="1" r:id="rId4vqg8skpe1wjhfcavroex">
+      <w:hyperlink w:history="1" r:id="rIdh2-hx6nnsjsu19vis0thf">
         <w:r>
           <w:rPr>
             <w:rStyle w:val="Hyperlink"/>
@@ -1127,17 +1142,16 @@
           <w:tcPr>
             <w:tcW w:type="dxa" w:w="9360"/>
             <w:tcBorders>
-              <w:top w:val="single" w:color="CCCCCC" w:sz="6"/>
-              <w:left w:val="single" w:color="CCCCCC" w:sz="6"/>
-              <w:bottom w:val="single" w:color="CCCCCC" w:sz="6"/>
-              <w:right w:val="single" w:color="CCCCCC" w:sz="6"/>
+              <w:top w:val="none" w:color="FFFFFF" w:sz="0"/>
+              <w:left w:val="none" w:color="FFFFFF" w:sz="0"/>
+              <w:bottom w:val="single" w:color="D1D5DB" w:sz="4"/>
+              <w:right w:val="none" w:color="FFFFFF" w:sz="0"/>
             </w:tcBorders>
-            <w:shd w:fill="1E2761" w:val="clear"/>
             <w:tcMar>
               <w:top w:type="dxa" w:w="200"/>
-              <w:left w:type="dxa" w:w="240"/>
-              <w:bottom w:type="dxa" w:w="200"/>
-              <w:right w:type="dxa" w:w="240"/>
+              <w:left w:type="dxa" w:w="0"/>
+              <w:bottom w:type="dxa" w:w="160"/>
+              <w:right w:type="dxa" w:w="0"/>
             </w:tcMar>
           </w:tcPr>
           <w:p>
@@ -1145,9 +1159,10 @@
               <w:rPr>
                 <w:b/>
                 <w:bCs/>
-                <w:color w:val="CADCFC"/>
-                <w:sz w:val="22"/>
-                <w:szCs w:val="22"/>
+                <w:color w:val="6B7280"/>
+                <w:spacing w:val="80"/>
+                <w:sz w:val="18"/>
+                <w:szCs w:val="18"/>
               </w:rPr>
               <w:t xml:space="preserve">WEEK 2</w:t>
             </w:r>
@@ -1157,9 +1172,9 @@
               <w:rPr>
                 <w:b/>
                 <w:bCs/>
-                <w:color w:val="FFFFFF"/>
-                <w:sz w:val="36"/>
-                <w:szCs w:val="36"/>
+                <w:color w:val="1E3A5F"/>
+                <w:sz w:val="44"/>
+                <w:szCs w:val="44"/>
               </w:rPr>
               <w:t xml:space="preserve">Personal Operating System</w:t>
             </w:r>
@@ -1169,7 +1184,7 @@
               <w:rPr>
                 <w:i/>
                 <w:iCs/>
-                <w:color w:val="CADCFC"/>
+                <w:color w:val="6B7280"/>
                 <w:sz w:val="22"/>
                 <w:szCs w:val="22"/>
               </w:rPr>
@@ -1212,7 +1227,7 @@
         <w:rPr>
           <w:b/>
           <w:bCs/>
-          <w:color w:val="B85042"/>
+          <w:color w:val="6B7280"/>
         </w:rPr>
         <w:t xml:space="preserve">Task 1: </w:t>
       </w:r>
@@ -1220,7 +1235,7 @@
         <w:rPr>
           <w:b/>
           <w:bCs/>
-          <w:color w:val="1E2761"/>
+          <w:color w:val="1E3A5F"/>
         </w:rPr>
         <w:t xml:space="preserve">Build a 5-Minute Morning Anchor</w:t>
       </w:r>
@@ -1328,7 +1343,7 @@
         <w:rPr>
           <w:b/>
           <w:bCs/>
-          <w:color w:val="B85042"/>
+          <w:color w:val="6B7280"/>
         </w:rPr>
         <w:t xml:space="preserve">Task 2: </w:t>
       </w:r>
@@ -1336,7 +1351,7 @@
         <w:rPr>
           <w:b/>
           <w:bCs/>
-          <w:color w:val="1E2761"/>
+          <w:color w:val="1E3A5F"/>
         </w:rPr>
         <w:t xml:space="preserve">Capture with Voice — Whisper Workflow</w:t>
       </w:r>
@@ -1419,15 +1434,15 @@
           <w:tcPr>
             <w:tcW w:type="dxa" w:w="9360"/>
             <w:tcBorders>
-              <w:top w:val="single" w:color="CCCCCC" w:sz="6"/>
-              <w:left w:val="single" w:color="CCCCCC" w:sz="6"/>
-              <w:bottom w:val="single" w:color="CCCCCC" w:sz="6"/>
-              <w:right w:val="single" w:color="CCCCCC" w:sz="6"/>
+              <w:top w:val="single" w:color="D1D5DB" w:sz="6"/>
+              <w:left w:val="single" w:color="1E3A5F" w:sz="18"/>
+              <w:bottom w:val="single" w:color="D1D5DB" w:sz="6"/>
+              <w:right w:val="single" w:color="D1D5DB" w:sz="6"/>
             </w:tcBorders>
-            <w:shd w:fill="EFF5EE" w:val="clear"/>
+            <w:shd w:fill="F4F5F7" w:val="clear"/>
             <w:tcMar>
               <w:top w:type="dxa" w:w="160"/>
-              <w:left w:type="dxa" w:w="200"/>
+              <w:left w:type="dxa" w:w="240"/>
               <w:bottom w:type="dxa" w:w="160"/>
               <w:right w:type="dxa" w:w="200"/>
             </w:tcMar>
@@ -1437,13 +1452,18 @@
               <w:rPr>
                 <w:b/>
                 <w:bCs/>
-                <w:color w:val="1E2761"/>
+                <w:color w:val="6B7280"/>
+                <w:sz w:val="18"/>
+                <w:szCs w:val="18"/>
               </w:rPr>
-              <w:t xml:space="preserve">Why this matters</w:t>
+              <w:t xml:space="preserve">WHY THIS MATTERS</w:t>
             </w:r>
           </w:p>
           <w:p>
             <w:r>
+              <w:rPr>
+                <w:color w:val="1A1A1A"/>
+              </w:rPr>
               <w:t xml:space="preserve">The cheapest thing you can do this week is stop losing 80% of your own ideas. Whisper is the cheapest mic-level upgrade in your life.</w:t>
             </w:r>
           </w:p>
@@ -1464,7 +1484,7 @@
         <w:rPr>
           <w:b/>
           <w:bCs/>
-          <w:color w:val="B85042"/>
+          <w:color w:val="6B7280"/>
         </w:rPr>
         <w:t xml:space="preserve">Task 3: </w:t>
       </w:r>
@@ -1472,7 +1492,7 @@
         <w:rPr>
           <w:b/>
           <w:bCs/>
-          <w:color w:val="1E2761"/>
+          <w:color w:val="1E3A5F"/>
         </w:rPr>
         <w:t xml:space="preserve">Tag Your Tasks — Tiered Autonomy in Practice</w:t>
       </w:r>
@@ -1612,7 +1632,7 @@
       <w:r>
         <w:t xml:space="preserve"/>
       </w:r>
-      <w:hyperlink w:history="1" r:id="rIdtno288tauztjg1fpbisye">
+      <w:hyperlink w:history="1" r:id="rIdao0whtu2txhrt1ed9nqgv">
         <w:r>
           <w:rPr>
             <w:rStyle w:val="Hyperlink"/>
@@ -1632,7 +1652,7 @@
       <w:r>
         <w:t xml:space="preserve"/>
       </w:r>
-      <w:hyperlink w:history="1" r:id="rIdbx4skn9ulyssn28sm-bml">
+      <w:hyperlink w:history="1" r:id="rIdyqb9y0ssqgpt2tsgxxov2">
         <w:r>
           <w:rPr>
             <w:rStyle w:val="Hyperlink"/>
@@ -1652,7 +1672,7 @@
       <w:r>
         <w:t xml:space="preserve"/>
       </w:r>
-      <w:hyperlink w:history="1" r:id="rId8wexi1roj0upm8wtzvrtq">
+      <w:hyperlink w:history="1" r:id="rIdxvippw3oseanaiq-odsmq">
         <w:r>
           <w:rPr>
             <w:rStyle w:val="Hyperlink"/>
@@ -1672,7 +1692,7 @@
       <w:r>
         <w:t xml:space="preserve"/>
       </w:r>
-      <w:hyperlink w:history="1" r:id="rIdrdsk8atborhwv-kkztzjp">
+      <w:hyperlink w:history="1" r:id="rIdzoqxxgug_e8imznehatyn">
         <w:r>
           <w:rPr>
             <w:rStyle w:val="Hyperlink"/>
@@ -1718,17 +1738,16 @@
           <w:tcPr>
             <w:tcW w:type="dxa" w:w="9360"/>
             <w:tcBorders>
-              <w:top w:val="single" w:color="CCCCCC" w:sz="6"/>
-              <w:left w:val="single" w:color="CCCCCC" w:sz="6"/>
-              <w:bottom w:val="single" w:color="CCCCCC" w:sz="6"/>
-              <w:right w:val="single" w:color="CCCCCC" w:sz="6"/>
+              <w:top w:val="none" w:color="FFFFFF" w:sz="0"/>
+              <w:left w:val="none" w:color="FFFFFF" w:sz="0"/>
+              <w:bottom w:val="single" w:color="D1D5DB" w:sz="4"/>
+              <w:right w:val="none" w:color="FFFFFF" w:sz="0"/>
             </w:tcBorders>
-            <w:shd w:fill="1E2761" w:val="clear"/>
             <w:tcMar>
               <w:top w:type="dxa" w:w="200"/>
-              <w:left w:type="dxa" w:w="240"/>
-              <w:bottom w:type="dxa" w:w="200"/>
-              <w:right w:type="dxa" w:w="240"/>
+              <w:left w:type="dxa" w:w="0"/>
+              <w:bottom w:type="dxa" w:w="160"/>
+              <w:right w:type="dxa" w:w="0"/>
             </w:tcMar>
           </w:tcPr>
           <w:p>
@@ -1736,9 +1755,10 @@
               <w:rPr>
                 <w:b/>
                 <w:bCs/>
-                <w:color w:val="CADCFC"/>
-                <w:sz w:val="22"/>
-                <w:szCs w:val="22"/>
+                <w:color w:val="6B7280"/>
+                <w:spacing w:val="80"/>
+                <w:sz w:val="18"/>
+                <w:szCs w:val="18"/>
               </w:rPr>
               <w:t xml:space="preserve">WEEK 3</w:t>
             </w:r>
@@ -1748,9 +1768,9 @@
               <w:rPr>
                 <w:b/>
                 <w:bCs/>
-                <w:color w:val="FFFFFF"/>
-                <w:sz w:val="36"/>
-                <w:szCs w:val="36"/>
+                <w:color w:val="1E3A5F"/>
+                <w:sz w:val="44"/>
+                <w:szCs w:val="44"/>
               </w:rPr>
               <w:t xml:space="preserve">Husband, Father, Brother: At Home</w:t>
             </w:r>
@@ -1760,7 +1780,7 @@
               <w:rPr>
                 <w:i/>
                 <w:iCs/>
-                <w:color w:val="CADCFC"/>
+                <w:color w:val="6B7280"/>
                 <w:sz w:val="22"/>
                 <w:szCs w:val="22"/>
               </w:rPr>
@@ -1803,7 +1823,7 @@
         <w:rPr>
           <w:b/>
           <w:bCs/>
-          <w:color w:val="B85042"/>
+          <w:color w:val="6B7280"/>
         </w:rPr>
         <w:t xml:space="preserve">Task 1: </w:t>
       </w:r>
@@ -1811,7 +1831,7 @@
         <w:rPr>
           <w:b/>
           <w:bCs/>
-          <w:color w:val="1E2761"/>
+          <w:color w:val="1E3A5F"/>
         </w:rPr>
         <w:t xml:space="preserve">Prep One Hard Conversation (Don't Hide Behind AI)</w:t>
       </w:r>
@@ -1906,15 +1926,15 @@
           <w:tcPr>
             <w:tcW w:type="dxa" w:w="9360"/>
             <w:tcBorders>
-              <w:top w:val="single" w:color="CCCCCC" w:sz="6"/>
-              <w:left w:val="single" w:color="CCCCCC" w:sz="6"/>
-              <w:bottom w:val="single" w:color="CCCCCC" w:sz="6"/>
-              <w:right w:val="single" w:color="CCCCCC" w:sz="6"/>
+              <w:top w:val="single" w:color="D1D5DB" w:sz="6"/>
+              <w:left w:val="single" w:color="1E3A5F" w:sz="18"/>
+              <w:bottom w:val="single" w:color="D1D5DB" w:sz="6"/>
+              <w:right w:val="single" w:color="D1D5DB" w:sz="6"/>
             </w:tcBorders>
-            <w:shd w:fill="EFF5EE" w:val="clear"/>
+            <w:shd w:fill="F4F5F7" w:val="clear"/>
             <w:tcMar>
               <w:top w:type="dxa" w:w="160"/>
-              <w:left w:type="dxa" w:w="200"/>
+              <w:left w:type="dxa" w:w="240"/>
               <w:bottom w:type="dxa" w:w="160"/>
               <w:right w:type="dxa" w:w="200"/>
             </w:tcMar>
@@ -1924,13 +1944,18 @@
               <w:rPr>
                 <w:b/>
                 <w:bCs/>
-                <w:color w:val="1E2761"/>
+                <w:color w:val="6B7280"/>
+                <w:sz w:val="18"/>
+                <w:szCs w:val="18"/>
               </w:rPr>
-              <w:t xml:space="preserve">Be gentle with her</w:t>
+              <w:t xml:space="preserve">BE GENTLE WITH HER</w:t>
             </w:r>
           </w:p>
           <w:p>
             <w:r>
+              <w:rPr>
+                <w:color w:val="1A1A1A"/>
+              </w:rPr>
               <w:t xml:space="preserve">She doesn't need a polished speech. She needs you, sober and present. AI is the prep room, not the pulpit.</w:t>
             </w:r>
           </w:p>
@@ -1951,7 +1976,7 @@
         <w:rPr>
           <w:b/>
           <w:bCs/>
-          <w:color w:val="B85042"/>
+          <w:color w:val="6B7280"/>
         </w:rPr>
         <w:t xml:space="preserve">Task 2: </w:t>
       </w:r>
@@ -1959,7 +1984,7 @@
         <w:rPr>
           <w:b/>
           <w:bCs/>
-          <w:color w:val="1E2761"/>
+          <w:color w:val="1E3A5F"/>
         </w:rPr>
         <w:t xml:space="preserve">Build a Family Rhythm Asset</w:t>
       </w:r>
@@ -2067,7 +2092,7 @@
         <w:rPr>
           <w:b/>
           <w:bCs/>
-          <w:color w:val="B85042"/>
+          <w:color w:val="6B7280"/>
         </w:rPr>
         <w:t xml:space="preserve">Task 3: </w:t>
       </w:r>
@@ -2075,7 +2100,7 @@
         <w:rPr>
           <w:b/>
           <w:bCs/>
-          <w:color w:val="1E2761"/>
+          <w:color w:val="1E3A5F"/>
         </w:rPr>
         <w:t xml:space="preserve">Write Your Family AI Policy (Together)</w:t>
       </w:r>
@@ -2239,7 +2264,7 @@
       <w:r>
         <w:t xml:space="preserve"/>
       </w:r>
-      <w:hyperlink w:history="1" r:id="rIdtucnzlirqzxy40ygu8pp3">
+      <w:hyperlink w:history="1" r:id="rIdz3jliose6ebtu-rigqxb3">
         <w:r>
           <w:rPr>
             <w:rStyle w:val="Hyperlink"/>
@@ -2259,7 +2284,7 @@
       <w:r>
         <w:t xml:space="preserve"/>
       </w:r>
-      <w:hyperlink w:history="1" r:id="rIdljpopjfuhkobdgjmeaax2">
+      <w:hyperlink w:history="1" r:id="rIdeokpvwplzdtx-hfcxtthg">
         <w:r>
           <w:rPr>
             <w:rStyle w:val="Hyperlink"/>
@@ -2317,17 +2342,16 @@
           <w:tcPr>
             <w:tcW w:type="dxa" w:w="9360"/>
             <w:tcBorders>
-              <w:top w:val="single" w:color="CCCCCC" w:sz="6"/>
-              <w:left w:val="single" w:color="CCCCCC" w:sz="6"/>
-              <w:bottom w:val="single" w:color="CCCCCC" w:sz="6"/>
-              <w:right w:val="single" w:color="CCCCCC" w:sz="6"/>
+              <w:top w:val="none" w:color="FFFFFF" w:sz="0"/>
+              <w:left w:val="none" w:color="FFFFFF" w:sz="0"/>
+              <w:bottom w:val="single" w:color="D1D5DB" w:sz="4"/>
+              <w:right w:val="none" w:color="FFFFFF" w:sz="0"/>
             </w:tcBorders>
-            <w:shd w:fill="1E2761" w:val="clear"/>
             <w:tcMar>
               <w:top w:type="dxa" w:w="200"/>
-              <w:left w:type="dxa" w:w="240"/>
-              <w:bottom w:type="dxa" w:w="200"/>
-              <w:right w:type="dxa" w:w="240"/>
+              <w:left w:type="dxa" w:w="0"/>
+              <w:bottom w:type="dxa" w:w="160"/>
+              <w:right w:type="dxa" w:w="0"/>
             </w:tcMar>
           </w:tcPr>
           <w:p>
@@ -2335,9 +2359,10 @@
               <w:rPr>
                 <w:b/>
                 <w:bCs/>
-                <w:color w:val="CADCFC"/>
-                <w:sz w:val="22"/>
-                <w:szCs w:val="22"/>
+                <w:color w:val="6B7280"/>
+                <w:spacing w:val="80"/>
+                <w:sz w:val="18"/>
+                <w:szCs w:val="18"/>
               </w:rPr>
               <w:t xml:space="preserve">WEEK 4</w:t>
             </w:r>
@@ -2347,9 +2372,9 @@
               <w:rPr>
                 <w:b/>
                 <w:bCs/>
-                <w:color w:val="FFFFFF"/>
-                <w:sz w:val="36"/>
-                <w:szCs w:val="36"/>
+                <w:color w:val="1E3A5F"/>
+                <w:sz w:val="44"/>
+                <w:szCs w:val="44"/>
               </w:rPr>
               <w:t xml:space="preserve">Business, Ministry &amp; Community</w:t>
             </w:r>
@@ -2359,7 +2384,7 @@
               <w:rPr>
                 <w:i/>
                 <w:iCs/>
-                <w:color w:val="CADCFC"/>
+                <w:color w:val="6B7280"/>
                 <w:sz w:val="22"/>
                 <w:szCs w:val="22"/>
               </w:rPr>
@@ -2402,7 +2427,7 @@
         <w:rPr>
           <w:b/>
           <w:bCs/>
-          <w:color w:val="B85042"/>
+          <w:color w:val="6B7280"/>
         </w:rPr>
         <w:t xml:space="preserve">Task 1: </w:t>
       </w:r>
@@ -2410,7 +2435,7 @@
         <w:rPr>
           <w:b/>
           <w:bCs/>
-          <w:color w:val="1E2761"/>
+          <w:color w:val="1E3A5F"/>
         </w:rPr>
         <w:t xml:space="preserve">Buy Back 5 Hours This Month</w:t>
       </w:r>
@@ -2493,15 +2518,15 @@
           <w:tcPr>
             <w:tcW w:type="dxa" w:w="9360"/>
             <w:tcBorders>
-              <w:top w:val="single" w:color="CCCCCC" w:sz="6"/>
-              <w:left w:val="single" w:color="CCCCCC" w:sz="6"/>
-              <w:bottom w:val="single" w:color="CCCCCC" w:sz="6"/>
-              <w:right w:val="single" w:color="CCCCCC" w:sz="6"/>
+              <w:top w:val="single" w:color="D1D5DB" w:sz="6"/>
+              <w:left w:val="single" w:color="1E3A5F" w:sz="18"/>
+              <w:bottom w:val="single" w:color="D1D5DB" w:sz="6"/>
+              <w:right w:val="single" w:color="D1D5DB" w:sz="6"/>
             </w:tcBorders>
-            <w:shd w:fill="EFF5EE" w:val="clear"/>
+            <w:shd w:fill="F4F5F7" w:val="clear"/>
             <w:tcMar>
               <w:top w:type="dxa" w:w="160"/>
-              <w:left w:type="dxa" w:w="200"/>
+              <w:left w:type="dxa" w:w="240"/>
               <w:bottom w:type="dxa" w:w="160"/>
               <w:right w:type="dxa" w:w="200"/>
             </w:tcMar>
@@ -2511,13 +2536,18 @@
               <w:rPr>
                 <w:b/>
                 <w:bCs/>
-                <w:color w:val="1E2761"/>
+                <w:color w:val="6B7280"/>
+                <w:sz w:val="18"/>
+                <w:szCs w:val="18"/>
               </w:rPr>
-              <w:t xml:space="preserve">Tiered autonomy reminder</w:t>
+              <w:t xml:space="preserve">TIERED AUTONOMY REMINDER</w:t>
             </w:r>
           </w:p>
           <w:p>
             <w:r>
+              <w:rPr>
+                <w:color w:val="1A1A1A"/>
+              </w:rPr>
               <w:t xml:space="preserve">Anything that touches money, access, or another person's wellbeing is sensitive. Sensitive tasks never auto-execute. The captain stays on the bridge.</w:t>
             </w:r>
           </w:p>
@@ -2538,7 +2568,7 @@
         <w:rPr>
           <w:b/>
           <w:bCs/>
-          <w:color w:val="B85042"/>
+          <w:color w:val="6B7280"/>
         </w:rPr>
         <w:t xml:space="preserve">Task 2: </w:t>
       </w:r>
@@ -2546,7 +2576,7 @@
         <w:rPr>
           <w:b/>
           <w:bCs/>
-          <w:color w:val="1E2761"/>
+          <w:color w:val="1E3A5F"/>
         </w:rPr>
         <w:t xml:space="preserve">Build One Ministry Workflow</w:t>
       </w:r>
@@ -2666,7 +2696,7 @@
         <w:rPr>
           <w:b/>
           <w:bCs/>
-          <w:color w:val="B85042"/>
+          <w:color w:val="6B7280"/>
         </w:rPr>
         <w:t xml:space="preserve">Task 3: </w:t>
       </w:r>
@@ -2674,7 +2704,7 @@
         <w:rPr>
           <w:b/>
           <w:bCs/>
-          <w:color w:val="1E2761"/>
+          <w:color w:val="1E3A5F"/>
         </w:rPr>
         <w:t xml:space="preserve">Save Your 3 Best Prompts as Skills</w:t>
       </w:r>
@@ -2814,7 +2844,7 @@
       <w:r>
         <w:t xml:space="preserve"/>
       </w:r>
-      <w:hyperlink w:history="1" r:id="rIdg8jekq9tj8eqyermfrznu">
+      <w:hyperlink w:history="1" r:id="rIdeh58bw6hjp2dnkt4wgmha">
         <w:r>
           <w:rPr>
             <w:rStyle w:val="Hyperlink"/>
@@ -2834,7 +2864,7 @@
       <w:r>
         <w:t xml:space="preserve"/>
       </w:r>
-      <w:hyperlink w:history="1" r:id="rIdpzigxwcqbhrwvc9evar84">
+      <w:hyperlink w:history="1" r:id="rIdwssit-yyrsrxocmotiinq">
         <w:r>
           <w:rPr>
             <w:rStyle w:val="Hyperlink"/>
@@ -2854,7 +2884,7 @@
       <w:r>
         <w:t xml:space="preserve"/>
       </w:r>
-      <w:hyperlink w:history="1" r:id="rIdf690sxkbtgs6fo7uaquao">
+      <w:hyperlink w:history="1" r:id="rId5dnlih-auoj1p9t5y6_bp">
         <w:r>
           <w:rPr>
             <w:rStyle w:val="Hyperlink"/>
@@ -2900,17 +2930,16 @@
           <w:tcPr>
             <w:tcW w:type="dxa" w:w="9360"/>
             <w:tcBorders>
-              <w:top w:val="single" w:color="CCCCCC" w:sz="6"/>
-              <w:left w:val="single" w:color="CCCCCC" w:sz="6"/>
-              <w:bottom w:val="single" w:color="CCCCCC" w:sz="6"/>
-              <w:right w:val="single" w:color="CCCCCC" w:sz="6"/>
+              <w:top w:val="none" w:color="FFFFFF" w:sz="0"/>
+              <w:left w:val="none" w:color="FFFFFF" w:sz="0"/>
+              <w:bottom w:val="single" w:color="D1D5DB" w:sz="4"/>
+              <w:right w:val="none" w:color="FFFFFF" w:sz="0"/>
             </w:tcBorders>
-            <w:shd w:fill="1E2761" w:val="clear"/>
             <w:tcMar>
               <w:top w:type="dxa" w:w="200"/>
-              <w:left w:type="dxa" w:w="240"/>
-              <w:bottom w:type="dxa" w:w="200"/>
-              <w:right w:type="dxa" w:w="240"/>
+              <w:left w:type="dxa" w:w="0"/>
+              <w:bottom w:type="dxa" w:w="160"/>
+              <w:right w:type="dxa" w:w="0"/>
             </w:tcMar>
           </w:tcPr>
           <w:p>
@@ -2918,9 +2947,10 @@
               <w:rPr>
                 <w:b/>
                 <w:bCs/>
-                <w:color w:val="CADCFC"/>
-                <w:sz w:val="22"/>
-                <w:szCs w:val="22"/>
+                <w:color w:val="6B7280"/>
+                <w:spacing w:val="80"/>
+                <w:sz w:val="18"/>
+                <w:szCs w:val="18"/>
               </w:rPr>
               <w:t xml:space="preserve">WEEK 5</w:t>
             </w:r>
@@ -2930,9 +2960,9 @@
               <w:rPr>
                 <w:b/>
                 <w:bCs/>
-                <w:color w:val="FFFFFF"/>
-                <w:sz w:val="36"/>
-                <w:szCs w:val="36"/>
+                <w:color w:val="1E3A5F"/>
+                <w:sz w:val="44"/>
+                <w:szCs w:val="44"/>
               </w:rPr>
               <w:t xml:space="preserve">Mastery, Stewardship &amp; Multiplication</w:t>
             </w:r>
@@ -2942,7 +2972,7 @@
               <w:rPr>
                 <w:i/>
                 <w:iCs/>
-                <w:color w:val="CADCFC"/>
+                <w:color w:val="6B7280"/>
                 <w:sz w:val="22"/>
                 <w:szCs w:val="22"/>
               </w:rPr>
@@ -2985,7 +3015,7 @@
         <w:rPr>
           <w:b/>
           <w:bCs/>
-          <w:color w:val="B85042"/>
+          <w:color w:val="6B7280"/>
         </w:rPr>
         <w:t xml:space="preserve">Task 1: </w:t>
       </w:r>
@@ -2993,7 +3023,7 @@
         <w:rPr>
           <w:b/>
           <w:bCs/>
-          <w:color w:val="1E2761"/>
+          <w:color w:val="1E3A5F"/>
         </w:rPr>
         <w:t xml:space="preserve">Run a Cost &amp; Trap Audit</w:t>
       </w:r>
@@ -3137,7 +3167,7 @@
         <w:rPr>
           <w:b/>
           <w:bCs/>
-          <w:color w:val="B85042"/>
+          <w:color w:val="6B7280"/>
         </w:rPr>
         <w:t xml:space="preserve">Task 2: </w:t>
       </w:r>
@@ -3145,7 +3175,7 @@
         <w:rPr>
           <w:b/>
           <w:bCs/>
-          <w:color w:val="1E2761"/>
+          <w:color w:val="1E3A5F"/>
         </w:rPr>
         <w:t xml:space="preserve">Teach One Person, This Week</w:t>
       </w:r>
@@ -3228,15 +3258,15 @@
           <w:tcPr>
             <w:tcW w:type="dxa" w:w="9360"/>
             <w:tcBorders>
-              <w:top w:val="single" w:color="CCCCCC" w:sz="6"/>
-              <w:left w:val="single" w:color="CCCCCC" w:sz="6"/>
-              <w:bottom w:val="single" w:color="CCCCCC" w:sz="6"/>
-              <w:right w:val="single" w:color="CCCCCC" w:sz="6"/>
+              <w:top w:val="single" w:color="D1D5DB" w:sz="6"/>
+              <w:left w:val="single" w:color="1E3A5F" w:sz="18"/>
+              <w:bottom w:val="single" w:color="D1D5DB" w:sz="6"/>
+              <w:right w:val="single" w:color="D1D5DB" w:sz="6"/>
             </w:tcBorders>
-            <w:shd w:fill="EFF5EE" w:val="clear"/>
+            <w:shd w:fill="F4F5F7" w:val="clear"/>
             <w:tcMar>
               <w:top w:type="dxa" w:w="160"/>
-              <w:left w:type="dxa" w:w="200"/>
+              <w:left w:type="dxa" w:w="240"/>
               <w:bottom w:type="dxa" w:w="160"/>
               <w:right w:type="dxa" w:w="200"/>
             </w:tcMar>
@@ -3246,13 +3276,18 @@
               <w:rPr>
                 <w:b/>
                 <w:bCs/>
-                <w:color w:val="1E2761"/>
+                <w:color w:val="6B7280"/>
+                <w:sz w:val="18"/>
+                <w:szCs w:val="18"/>
               </w:rPr>
-              <w:t xml:space="preserve">Why this is the hardest task</w:t>
+              <w:t xml:space="preserve">WHY THIS IS THE HARDEST TASK</w:t>
             </w:r>
           </w:p>
           <w:p>
             <w:r>
+              <w:rPr>
+                <w:color w:val="1A1A1A"/>
+              </w:rPr>
               <w:t xml:space="preserve">Most captains finish bootcamps and tell no one. They keep the gold and bury it. Don't. The 2 Timothy 2:2 chain breaks in your generation if you don't pass it.</w:t>
             </w:r>
           </w:p>
@@ -3273,7 +3308,7 @@
         <w:rPr>
           <w:b/>
           <w:bCs/>
-          <w:color w:val="B85042"/>
+          <w:color w:val="6B7280"/>
         </w:rPr>
         <w:t xml:space="preserve">Task 3: </w:t>
       </w:r>
@@ -3281,7 +3316,7 @@
         <w:rPr>
           <w:b/>
           <w:bCs/>
-          <w:color w:val="1E2761"/>
+          <w:color w:val="1E3A5F"/>
         </w:rPr>
         <w:t xml:space="preserve">Write Your Captain's Charter</w:t>
       </w:r>
@@ -3433,7 +3468,7 @@
       <w:r>
         <w:t xml:space="preserve"/>
       </w:r>
-      <w:hyperlink w:history="1" r:id="rId3ywy0nxlhxywtkuajryez">
+      <w:hyperlink w:history="1" r:id="rIdxytqjjkaa_n4t9du_yx4o">
         <w:r>
           <w:rPr>
             <w:rStyle w:val="Hyperlink"/>
@@ -3453,7 +3488,7 @@
       <w:r>
         <w:t xml:space="preserve"/>
       </w:r>
-      <w:hyperlink w:history="1" r:id="rIdhchxeay3aqtup-rc7eahl">
+      <w:hyperlink w:history="1" r:id="rIdirj_nz8na1lp6_ooghdxm">
         <w:r>
           <w:rPr>
             <w:rStyle w:val="Hyperlink"/>
@@ -3473,7 +3508,7 @@
       <w:r>
         <w:t xml:space="preserve"/>
       </w:r>
-      <w:hyperlink w:history="1" r:id="rIdue489rr9t2izpf3v4ejmy">
+      <w:hyperlink w:history="1" r:id="rIdw3uhqcbfdiolfri8qj63t">
         <w:r>
           <w:rPr>
             <w:rStyle w:val="Hyperlink"/>
@@ -3493,7 +3528,7 @@
       <w:r>
         <w:t xml:space="preserve"/>
       </w:r>
-      <w:hyperlink w:history="1" r:id="rIdkfpzy0tav2jaff-la4nvq">
+      <w:hyperlink w:history="1" r:id="rIdepg_hrvhqmf0jaxkdlzcn">
         <w:r>
           <w:rPr>
             <w:rStyle w:val="Hyperlink"/>
@@ -3513,7 +3548,7 @@
       <w:r>
         <w:t xml:space="preserve"/>
       </w:r>
-      <w:hyperlink w:history="1" r:id="rIdeifxjcz4y8ka69injelcz">
+      <w:hyperlink w:history="1" r:id="rId5nunx83zhoa4akxryp1m_">
         <w:r>
           <w:rPr>
             <w:rStyle w:val="Hyperlink"/>
@@ -5098,7 +5133,7 @@
       <w:rFonts w:ascii="Calibri" w:cs="Calibri" w:eastAsia="Calibri" w:hAnsi="Calibri"/>
       <w:b/>
       <w:bCs/>
-      <w:color w:val="1E2761"/>
+      <w:color w:val="1E3A5F"/>
       <w:sz w:val="36"/>
       <w:szCs w:val="36"/>
     </w:rPr>
@@ -5116,7 +5151,7 @@
       <w:rFonts w:ascii="Calibri" w:cs="Calibri" w:eastAsia="Calibri" w:hAnsi="Calibri"/>
       <w:b/>
       <w:bCs/>
-      <w:color w:val="1E2761"/>
+      <w:color w:val="1E3A5F"/>
       <w:sz w:val="28"/>
       <w:szCs w:val="28"/>
     </w:rPr>
@@ -5134,7 +5169,7 @@
       <w:rFonts w:ascii="Calibri" w:cs="Calibri" w:eastAsia="Calibri" w:hAnsi="Calibri"/>
       <w:b/>
       <w:bCs/>
-      <w:color w:val="B85042"/>
+      <w:color w:val="6B7280"/>
       <w:sz w:val="24"/>
       <w:szCs w:val="24"/>
     </w:rPr>

</xml_diff>

<commit_message>
rebrand: FC docs — strip "USMC Ministries · usmcmin.org" credits
Master.docx, Workbook.docx, Deck.pptx, Drills PDF, Task PDFs zip rebuilt with "Family Captain" wordmark/footer instead of "USMC Ministries · usmcmin.org". TFC gives MOOP a $850/mo discount; FC docs are appropriately Family Captain branded.
</commit_message>
<xml_diff>
--- a/downloads/family-captain/Family_Captain_Bootcamp_MASTER.docx
+++ b/downloads/family-captain/Family_Captain_Bootcamp_MASTER.docx
@@ -74,7 +74,7 @@
           <w:sz w:val="20"/>
           <w:szCs w:val="20"/>
         </w:rPr>
-        <w:t xml:space="preserve">USMC Ministries · usmcmin.org</w:t>
+        <w:t xml:space="preserve">Family Captain</w:t>
       </w:r>
     </w:p>
     <w:p>
@@ -1056,7 +1056,7 @@
       <w:r>
         <w:t xml:space="preserve"/>
       </w:r>
-      <w:hyperlink w:history="1" r:id="rIdcgkhonsfagkfljpcevb-q">
+      <w:hyperlink w:history="1" r:id="rIdcz5h9hgl-jwg34ahscyox">
         <w:r>
           <w:rPr>
             <w:rStyle w:val="Hyperlink"/>
@@ -1076,7 +1076,7 @@
       <w:r>
         <w:t xml:space="preserve"/>
       </w:r>
-      <w:hyperlink w:history="1" r:id="rIdipeoa39kpauzbak01eyvl">
+      <w:hyperlink w:history="1" r:id="rIdx0ak5zmtyk0b3sfbp58rk">
         <w:r>
           <w:rPr>
             <w:rStyle w:val="Hyperlink"/>
@@ -1096,7 +1096,7 @@
       <w:r>
         <w:t xml:space="preserve"/>
       </w:r>
-      <w:hyperlink w:history="1" r:id="rIdh2-hx6nnsjsu19vis0thf">
+      <w:hyperlink w:history="1" r:id="rId-ziijawlvg2fldeopsdmr">
         <w:r>
           <w:rPr>
             <w:rStyle w:val="Hyperlink"/>
@@ -1632,7 +1632,7 @@
       <w:r>
         <w:t xml:space="preserve"/>
       </w:r>
-      <w:hyperlink w:history="1" r:id="rIdao0whtu2txhrt1ed9nqgv">
+      <w:hyperlink w:history="1" r:id="rIdoqy_sab3iidisoctk2l8w">
         <w:r>
           <w:rPr>
             <w:rStyle w:val="Hyperlink"/>
@@ -1652,7 +1652,7 @@
       <w:r>
         <w:t xml:space="preserve"/>
       </w:r>
-      <w:hyperlink w:history="1" r:id="rIdyqb9y0ssqgpt2tsgxxov2">
+      <w:hyperlink w:history="1" r:id="rIdindxkogyftcz7olhkagiu">
         <w:r>
           <w:rPr>
             <w:rStyle w:val="Hyperlink"/>
@@ -1672,7 +1672,7 @@
       <w:r>
         <w:t xml:space="preserve"/>
       </w:r>
-      <w:hyperlink w:history="1" r:id="rIdxvippw3oseanaiq-odsmq">
+      <w:hyperlink w:history="1" r:id="rId1bywq4tynabl_7tl9vzxe">
         <w:r>
           <w:rPr>
             <w:rStyle w:val="Hyperlink"/>
@@ -1692,7 +1692,7 @@
       <w:r>
         <w:t xml:space="preserve"/>
       </w:r>
-      <w:hyperlink w:history="1" r:id="rIdzoqxxgug_e8imznehatyn">
+      <w:hyperlink w:history="1" r:id="rIduc0gcd0gpuu7lfodgesgf">
         <w:r>
           <w:rPr>
             <w:rStyle w:val="Hyperlink"/>
@@ -2264,7 +2264,7 @@
       <w:r>
         <w:t xml:space="preserve"/>
       </w:r>
-      <w:hyperlink w:history="1" r:id="rIdz3jliose6ebtu-rigqxb3">
+      <w:hyperlink w:history="1" r:id="rId03cfafrdkd7dwzlqynik3">
         <w:r>
           <w:rPr>
             <w:rStyle w:val="Hyperlink"/>
@@ -2284,7 +2284,7 @@
       <w:r>
         <w:t xml:space="preserve"/>
       </w:r>
-      <w:hyperlink w:history="1" r:id="rIdeokpvwplzdtx-hfcxtthg">
+      <w:hyperlink w:history="1" r:id="rIdvgredoyzpoyfwexkkft44">
         <w:r>
           <w:rPr>
             <w:rStyle w:val="Hyperlink"/>
@@ -2844,7 +2844,7 @@
       <w:r>
         <w:t xml:space="preserve"/>
       </w:r>
-      <w:hyperlink w:history="1" r:id="rIdeh58bw6hjp2dnkt4wgmha">
+      <w:hyperlink w:history="1" r:id="rIdowf-tdnovvr8co3j0m3oh">
         <w:r>
           <w:rPr>
             <w:rStyle w:val="Hyperlink"/>
@@ -2864,7 +2864,7 @@
       <w:r>
         <w:t xml:space="preserve"/>
       </w:r>
-      <w:hyperlink w:history="1" r:id="rIdwssit-yyrsrxocmotiinq">
+      <w:hyperlink w:history="1" r:id="rId5sbprmwefomk9cpqoyae8">
         <w:r>
           <w:rPr>
             <w:rStyle w:val="Hyperlink"/>
@@ -2884,7 +2884,7 @@
       <w:r>
         <w:t xml:space="preserve"/>
       </w:r>
-      <w:hyperlink w:history="1" r:id="rId5dnlih-auoj1p9t5y6_bp">
+      <w:hyperlink w:history="1" r:id="rIdyc6m3artquutkoauftx28">
         <w:r>
           <w:rPr>
             <w:rStyle w:val="Hyperlink"/>
@@ -3468,7 +3468,7 @@
       <w:r>
         <w:t xml:space="preserve"/>
       </w:r>
-      <w:hyperlink w:history="1" r:id="rIdxytqjjkaa_n4t9du_yx4o">
+      <w:hyperlink w:history="1" r:id="rIdppyjewlxm3pclfwz_zlrv">
         <w:r>
           <w:rPr>
             <w:rStyle w:val="Hyperlink"/>
@@ -3488,7 +3488,7 @@
       <w:r>
         <w:t xml:space="preserve"/>
       </w:r>
-      <w:hyperlink w:history="1" r:id="rIdirj_nz8na1lp6_ooghdxm">
+      <w:hyperlink w:history="1" r:id="rIdscxue3y0upyvixxbero_j">
         <w:r>
           <w:rPr>
             <w:rStyle w:val="Hyperlink"/>
@@ -3508,7 +3508,7 @@
       <w:r>
         <w:t xml:space="preserve"/>
       </w:r>
-      <w:hyperlink w:history="1" r:id="rIdw3uhqcbfdiolfri8qj63t">
+      <w:hyperlink w:history="1" r:id="rId8puo6vwfm6tjihxivg6mc">
         <w:r>
           <w:rPr>
             <w:rStyle w:val="Hyperlink"/>
@@ -3528,7 +3528,7 @@
       <w:r>
         <w:t xml:space="preserve"/>
       </w:r>
-      <w:hyperlink w:history="1" r:id="rIdepg_hrvhqmf0jaxkdlzcn">
+      <w:hyperlink w:history="1" r:id="rIdduapm_o80ihwu6s-ckfpn">
         <w:r>
           <w:rPr>
             <w:rStyle w:val="Hyperlink"/>
@@ -3548,7 +3548,7 @@
       <w:r>
         <w:t xml:space="preserve"/>
       </w:r>
-      <w:hyperlink w:history="1" r:id="rId5nunx83zhoa4akxryp1m_">
+      <w:hyperlink w:history="1" r:id="rIdehlk0qhz_t0clpv--1nnk">
         <w:r>
           <w:rPr>
             <w:rStyle w:val="Hyperlink"/>
@@ -4717,7 +4717,7 @@
         <w:sz w:val="18"/>
         <w:szCs w:val="18"/>
       </w:rPr>
-      <w:t xml:space="preserve">USMC Ministries · usmcmin.org · </w:t>
+      <w:t xml:space="preserve">Family Captain · </w:t>
     </w:r>
     <w:r>
       <w:rPr>

</xml_diff>

<commit_message>
Phase D.3.2: 7-week artifacts (Armada order) + heartbeat posts
Master/Workbook/Deck/Drills/zip regenerated in Armada order. New: Family_Captain_Heartbeat_Posts.md — 21 cohort drops (7 weeks x Mon Kickoff/Wed Check/Fri Sit). Scripture refs link to usmcmin.org/bible.html throughout.
</commit_message>
<xml_diff>
--- a/downloads/family-captain/Family_Captain_Bootcamp_MASTER.docx
+++ b/downloads/family-captain/Family_Captain_Bootcamp_MASTER.docx
@@ -294,7 +294,7 @@
         <w:pStyle w:val="Heading3"/>
       </w:pPr>
       <w:r>
-        <w:t xml:space="preserve">Week 1 · Visioning</w:t>
+        <w:t xml:space="preserve">Week 1 · Vision</w:t>
       </w:r>
     </w:p>
     <w:p>
@@ -338,7 +338,7 @@
         <w:pStyle w:val="Heading3"/>
       </w:pPr>
       <w:r>
-        <w:t xml:space="preserve">Week 2 · Husbanding</w:t>
+        <w:t xml:space="preserve">Week 2 · Body</w:t>
       </w:r>
     </w:p>
     <w:p>
@@ -353,7 +353,7 @@
           <w:sz w:val="22"/>
           <w:szCs w:val="22"/>
         </w:rPr>
-        <w:t xml:space="preserve">Lead with love. The captain's first crew is one woman.</w:t>
+        <w:t xml:space="preserve">Steward the temple. The captain trains the body that carries the load.</w:t>
       </w:r>
     </w:p>
     <w:p>
@@ -374,7 +374,7 @@
           <w:sz w:val="22"/>
           <w:szCs w:val="22"/>
         </w:rPr>
-        <w:t xml:space="preserve">Ephesians 5:25-28</w:t>
+        <w:t xml:space="preserve">1 Corinthians 6:19-20</w:t>
       </w:r>
     </w:p>
     <w:p>
@@ -382,7 +382,7 @@
         <w:pStyle w:val="Heading3"/>
       </w:pPr>
       <w:r>
-        <w:t xml:space="preserve">Week 3 · Fathering</w:t>
+        <w:t xml:space="preserve">Week 3 · Spiritual</w:t>
       </w:r>
     </w:p>
     <w:p>
@@ -397,7 +397,7 @@
           <w:sz w:val="22"/>
           <w:szCs w:val="22"/>
         </w:rPr>
-        <w:t xml:space="preserve">Train up your children. AI assists; the captain disciples.</w:t>
+        <w:t xml:space="preserve">Walk with God. The captain's command flows from his communion.</w:t>
       </w:r>
     </w:p>
     <w:p>
@@ -418,7 +418,7 @@
           <w:sz w:val="22"/>
           <w:szCs w:val="22"/>
         </w:rPr>
-        <w:t xml:space="preserve">Deuteronomy 6:6-7</w:t>
+        <w:t xml:space="preserve">Joshua 1:8</w:t>
       </w:r>
     </w:p>
     <w:p>
@@ -426,7 +426,7 @@
         <w:pStyle w:val="Heading3"/>
       </w:pPr>
       <w:r>
-        <w:t xml:space="preserve">Week 4 · Spiritual</w:t>
+        <w:t xml:space="preserve">Week 4 · Husbanding</w:t>
       </w:r>
     </w:p>
     <w:p>
@@ -441,7 +441,7 @@
           <w:sz w:val="22"/>
           <w:szCs w:val="22"/>
         </w:rPr>
-        <w:t xml:space="preserve">Walk with God. The captain's command flows from his communion.</w:t>
+        <w:t xml:space="preserve">Lead with love. The captain's first crew is one woman.</w:t>
       </w:r>
     </w:p>
     <w:p>
@@ -462,7 +462,7 @@
           <w:sz w:val="22"/>
           <w:szCs w:val="22"/>
         </w:rPr>
-        <w:t xml:space="preserve">Joshua 1:8</w:t>
+        <w:t xml:space="preserve">Ephesians 5:25-28</w:t>
       </w:r>
     </w:p>
     <w:p>
@@ -470,7 +470,7 @@
         <w:pStyle w:val="Heading3"/>
       </w:pPr>
       <w:r>
-        <w:t xml:space="preserve">Week 5 · Body</w:t>
+        <w:t xml:space="preserve">Week 5 · Fathering</w:t>
       </w:r>
     </w:p>
     <w:p>
@@ -485,7 +485,7 @@
           <w:sz w:val="22"/>
           <w:szCs w:val="22"/>
         </w:rPr>
-        <w:t xml:space="preserve">Steward the temple. The captain trains the body that carries the load.</w:t>
+        <w:t xml:space="preserve">Train up your children. AI assists; the captain disciples.</w:t>
       </w:r>
     </w:p>
     <w:p>
@@ -506,7 +506,7 @@
           <w:sz w:val="22"/>
           <w:szCs w:val="22"/>
         </w:rPr>
-        <w:t xml:space="preserve">1 Corinthians 6:19-20</w:t>
+        <w:t xml:space="preserve">Deuteronomy 6:6-7</w:t>
       </w:r>
     </w:p>
     <w:p>
@@ -514,7 +514,7 @@
         <w:pStyle w:val="Heading3"/>
       </w:pPr>
       <w:r>
-        <w:t xml:space="preserve">Week 6 · Finances</w:t>
+        <w:t xml:space="preserve">Week 6 · Finance</w:t>
       </w:r>
     </w:p>
     <w:p>
@@ -622,7 +622,7 @@
         <w:pStyle w:val="Heading1"/>
       </w:pPr>
       <w:r>
-        <w:t xml:space="preserve">Visioning</w:t>
+        <w:t xml:space="preserve">Vision</w:t>
       </w:r>
     </w:p>
     <w:p>
@@ -1351,7 +1351,7 @@
         <w:pStyle w:val="Heading1"/>
       </w:pPr>
       <w:r>
-        <w:t xml:space="preserve">Husbanding</w:t>
+        <w:t xml:space="preserve">Body</w:t>
       </w:r>
     </w:p>
     <w:p>
@@ -1366,7 +1366,7 @@
           <w:sz w:val="22"/>
           <w:szCs w:val="22"/>
         </w:rPr>
-        <w:t xml:space="preserve">Lead with love. The captain's first crew is one woman.</w:t>
+        <w:t xml:space="preserve">Steward the temple. The captain trains the body that carries the load.</w:t>
       </w:r>
     </w:p>
     <w:p>
@@ -1387,7 +1387,7 @@
           <w:sz w:val="22"/>
           <w:szCs w:val="22"/>
         </w:rPr>
-        <w:t xml:space="preserve">Every captain has a primary crew of one. Before fathering, before ministry, before mastery — there is a wife. This week is not about romance. It's about leadership in the home that the world never sees but the next generation feels for forty years.</w:t>
+        <w:t xml:space="preserve">Your body is the boat. Vision without the strength to carry it forward is just journaling. This week, the temple gets maintenance — movement, food, sleep — because the family follows the captain who shows up, not the one who fades.</w:t>
       </w:r>
     </w:p>
     <w:p>
@@ -1410,7 +1410,7 @@
           <w:sz w:val="22"/>
           <w:szCs w:val="22"/>
         </w:rPr>
-        <w:t xml:space="preserve">"Husbands, love your wives, as Christ loved the church and gave himself up for her."</w:t>
+        <w:t xml:space="preserve">"Your body is a temple of the Holy Spirit. Glorify God in your body."</w:t>
       </w:r>
     </w:p>
     <w:p>
@@ -1423,7 +1423,7 @@
           <w:sz w:val="20"/>
           <w:szCs w:val="20"/>
         </w:rPr>
-        <w:t xml:space="preserve">— Ephesians 5:25-28</w:t>
+        <w:t xml:space="preserve">— 1 Corinthians 6:19-20</w:t>
       </w:r>
     </w:p>
     <w:p>
@@ -1444,6 +1444,1448 @@
           <w:szCs w:val="18"/>
         </w:rPr>
         <w:t xml:space="preserve">WEEK 2 · TASK 1</w:t>
+      </w:r>
+    </w:p>
+    <w:p>
+      <w:pPr>
+        <w:pStyle w:val="Heading2"/>
+      </w:pPr>
+      <w:r>
+        <w:t xml:space="preserve">Weekly Movement Practice</w:t>
+      </w:r>
+    </w:p>
+    <w:p>
+      <w:pPr>
+        <w:spacing w:after="120"/>
+      </w:pPr>
+      <w:r>
+        <w:rPr>
+          <w:i/>
+          <w:iCs/>
+          <w:color w:val="475569"/>
+          <w:sz w:val="22"/>
+          <w:szCs w:val="22"/>
+        </w:rPr>
+        <w:t xml:space="preserve">3× strength + 2× walking. On the calendar. Not a wish.</w:t>
+      </w:r>
+    </w:p>
+    <w:p>
+      <w:pPr>
+        <w:pBdr>
+          <w:bottom w:val="single" w:color="CE8E31" w:sz="6" w:space="1"/>
+        </w:pBdr>
+        <w:spacing w:after="120"/>
+      </w:pPr>
+    </w:p>
+    <w:p>
+      <w:pPr>
+        <w:spacing w:after="120"/>
+      </w:pPr>
+      <w:r>
+        <w:rPr>
+          <w:color w:val="1A1A1A"/>
+          <w:sz w:val="22"/>
+          <w:szCs w:val="22"/>
+        </w:rPr>
+        <w:t xml:space="preserve">Your body is the boat. The bootcamp doesn't make you a different man if you can't carry your wife's groceries up two flights.</w:t>
+      </w:r>
+    </w:p>
+    <w:p>
+      <w:pPr>
+        <w:pStyle w:val="Heading3"/>
+      </w:pPr>
+      <w:r>
+        <w:t xml:space="preserve">Action checklist</w:t>
+      </w:r>
+    </w:p>
+    <w:p>
+      <w:pPr>
+        <w:pStyle w:val="ListParagraph"/>
+        <w:numPr>
+          <w:ilvl w:val="0"/>
+          <w:numId w:val="3"/>
+        </w:numPr>
+      </w:pPr>
+      <w:r>
+        <w:rPr>
+          <w:sz w:val="22"/>
+          <w:szCs w:val="22"/>
+        </w:rPr>
+        <w:t xml:space="preserve">Open Claude. Give your current state honestly. Note injuries.</w:t>
+      </w:r>
+    </w:p>
+    <w:p>
+      <w:pPr>
+        <w:pStyle w:val="ListParagraph"/>
+        <w:numPr>
+          <w:ilvl w:val="0"/>
+          <w:numId w:val="3"/>
+        </w:numPr>
+      </w:pPr>
+      <w:r>
+        <w:rPr>
+          <w:sz w:val="22"/>
+          <w:szCs w:val="22"/>
+        </w:rPr>
+        <w:t xml:space="preserve">Ask for a 4-week plan: 3 strength + 2 walking + 1 rest (Sabbath).</w:t>
+      </w:r>
+    </w:p>
+    <w:p>
+      <w:pPr>
+        <w:pStyle w:val="ListParagraph"/>
+        <w:numPr>
+          <w:ilvl w:val="0"/>
+          <w:numId w:val="3"/>
+        </w:numPr>
+      </w:pPr>
+      <w:r>
+        <w:rPr>
+          <w:sz w:val="22"/>
+          <w:szCs w:val="22"/>
+        </w:rPr>
+        <w:t xml:space="preserve">Put every session on the calendar THIS week.</w:t>
+      </w:r>
+    </w:p>
+    <w:p>
+      <w:pPr>
+        <w:pStyle w:val="ListParagraph"/>
+        <w:numPr>
+          <w:ilvl w:val="0"/>
+          <w:numId w:val="3"/>
+        </w:numPr>
+      </w:pPr>
+      <w:r>
+        <w:rPr>
+          <w:sz w:val="22"/>
+          <w:szCs w:val="22"/>
+        </w:rPr>
+        <w:t xml:space="preserve">Track it. Show up imperfectly.</w:t>
+      </w:r>
+    </w:p>
+    <w:p>
+      <w:pPr>
+        <w:spacing w:after="120"/>
+      </w:pPr>
+      <w:r>
+        <w:t xml:space="preserve"/>
+      </w:r>
+    </w:p>
+    <w:tbl>
+      <w:tblPr>
+        <w:tblW w:type="dxa" w:w="9360"/>
+        <w:tblBorders>
+          <w:top w:val="single" w:color="auto" w:sz="4"/>
+          <w:left w:val="single" w:color="auto" w:sz="4"/>
+          <w:bottom w:val="single" w:color="auto" w:sz="4"/>
+          <w:right w:val="single" w:color="auto" w:sz="4"/>
+          <w:insideH w:val="single" w:color="auto" w:sz="4"/>
+          <w:insideV w:val="single" w:color="auto" w:sz="4"/>
+        </w:tblBorders>
+      </w:tblPr>
+      <w:tblGrid>
+        <w:gridCol w:w="9360"/>
+      </w:tblGrid>
+      <w:tr>
+        <w:tc>
+          <w:tcPr>
+            <w:tcW w:type="dxa" w:w="9360"/>
+            <w:tcBorders>
+              <w:top w:val="single" w:color="D1D5DB" w:sz="4"/>
+              <w:left w:val="single" w:color="1E293B" w:sz="24"/>
+              <w:bottom w:val="single" w:color="D1D5DB" w:sz="4"/>
+              <w:right w:val="single" w:color="D1D5DB" w:sz="4"/>
+            </w:tcBorders>
+            <w:shd w:fill="F4F5F7" w:val="clear"/>
+            <w:tcMar>
+              <w:top w:type="dxa" w:w="160"/>
+              <w:left w:type="dxa" w:w="240"/>
+              <w:bottom w:type="dxa" w:w="160"/>
+              <w:right w:type="dxa" w:w="240"/>
+            </w:tcMar>
+          </w:tcPr>
+          <w:p>
+            <w:pPr>
+              <w:spacing w:after="60"/>
+            </w:pPr>
+            <w:r>
+              <w:rPr>
+                <w:b/>
+                <w:bCs/>
+                <w:color w:val="CE8E31"/>
+                <w:sz w:val="18"/>
+                <w:szCs w:val="18"/>
+              </w:rPr>
+              <w:t xml:space="preserve">IF YOU'RE A BEGINNER</w:t>
+            </w:r>
+          </w:p>
+          <w:p>
+            <w:r>
+              <w:rPr>
+                <w:sz w:val="22"/>
+                <w:szCs w:val="22"/>
+              </w:rPr>
+              <w:t xml:space="preserve">Start lower than you think. The win is 5 sessions this week. Not impressive numbers. Just reps.</w:t>
+            </w:r>
+          </w:p>
+        </w:tc>
+      </w:tr>
+    </w:tbl>
+    <w:p>
+      <w:pPr>
+        <w:spacing w:after="120"/>
+      </w:pPr>
+      <w:r>
+        <w:t xml:space="preserve"/>
+      </w:r>
+    </w:p>
+    <w:p>
+      <w:pPr>
+        <w:pStyle w:val="Heading3"/>
+      </w:pPr>
+      <w:r>
+        <w:t xml:space="preserve">Scripture sit</w:t>
+      </w:r>
+    </w:p>
+    <w:p>
+      <w:pPr>
+        <w:spacing w:after="120"/>
+      </w:pPr>
+      <w:r>
+        <w:rPr>
+          <w:i/>
+          <w:iCs/>
+          <w:color w:val="1A1A1A"/>
+          <w:sz w:val="22"/>
+          <w:szCs w:val="22"/>
+        </w:rPr>
+        <w:t xml:space="preserve">1 Corinthians 6:19-20 — Glorify God in your body.</w:t>
+      </w:r>
+    </w:p>
+    <w:p>
+      <w:r>
+        <w:br w:type="page"/>
+      </w:r>
+    </w:p>
+    <w:p>
+      <w:pPr>
+        <w:spacing w:after="60"/>
+      </w:pPr>
+      <w:r>
+        <w:rPr>
+          <w:b/>
+          <w:bCs/>
+          <w:color w:val="CE8E31"/>
+          <w:sz w:val="18"/>
+          <w:szCs w:val="18"/>
+        </w:rPr>
+        <w:t xml:space="preserve">WEEK 2 · TASK 2</w:t>
+      </w:r>
+    </w:p>
+    <w:p>
+      <w:pPr>
+        <w:pStyle w:val="Heading2"/>
+      </w:pPr>
+      <w:r>
+        <w:t xml:space="preserve">Captain's Meal Plan</w:t>
+      </w:r>
+    </w:p>
+    <w:p>
+      <w:pPr>
+        <w:spacing w:after="120"/>
+      </w:pPr>
+      <w:r>
+        <w:rPr>
+          <w:i/>
+          <w:iCs/>
+          <w:color w:val="475569"/>
+          <w:sz w:val="22"/>
+          <w:szCs w:val="22"/>
+        </w:rPr>
+        <w:t xml:space="preserve">Protein-forward one-week plan. AI drafts. Shopper collaborates.</w:t>
+      </w:r>
+    </w:p>
+    <w:p>
+      <w:pPr>
+        <w:pBdr>
+          <w:bottom w:val="single" w:color="CE8E31" w:sz="6" w:space="1"/>
+        </w:pBdr>
+        <w:spacing w:after="120"/>
+      </w:pPr>
+    </w:p>
+    <w:p>
+      <w:pPr>
+        <w:spacing w:after="120"/>
+      </w:pPr>
+      <w:r>
+        <w:rPr>
+          <w:color w:val="1A1A1A"/>
+          <w:sz w:val="22"/>
+          <w:szCs w:val="22"/>
+        </w:rPr>
+        <w:t xml:space="preserve">Most family captains lose this battle by 6pm because they didn't decide at 9am.</w:t>
+      </w:r>
+    </w:p>
+    <w:p>
+      <w:pPr>
+        <w:pStyle w:val="Heading3"/>
+      </w:pPr>
+      <w:r>
+        <w:t xml:space="preserve">Action checklist</w:t>
+      </w:r>
+    </w:p>
+    <w:p>
+      <w:pPr>
+        <w:pStyle w:val="ListParagraph"/>
+        <w:numPr>
+          <w:ilvl w:val="0"/>
+          <w:numId w:val="3"/>
+        </w:numPr>
+      </w:pPr>
+      <w:r>
+        <w:rPr>
+          <w:sz w:val="22"/>
+          <w:szCs w:val="22"/>
+        </w:rPr>
+        <w:t xml:space="preserve">Open Claude. Household details: kids' ages, allergies, budget.</w:t>
+      </w:r>
+    </w:p>
+    <w:p>
+      <w:pPr>
+        <w:pStyle w:val="ListParagraph"/>
+        <w:numPr>
+          <w:ilvl w:val="0"/>
+          <w:numId w:val="3"/>
+        </w:numPr>
+      </w:pPr>
+      <w:r>
+        <w:rPr>
+          <w:sz w:val="22"/>
+          <w:szCs w:val="22"/>
+        </w:rPr>
+        <w:t xml:space="preserve">Ask for 7 protein-forward dinners (~30 min prep) + grouped grocery list + 2 lunch defaults + 1 easy night.</w:t>
+      </w:r>
+    </w:p>
+    <w:p>
+      <w:pPr>
+        <w:pStyle w:val="ListParagraph"/>
+        <w:numPr>
+          <w:ilvl w:val="0"/>
+          <w:numId w:val="3"/>
+        </w:numPr>
+      </w:pPr>
+      <w:r>
+        <w:rPr>
+          <w:sz w:val="22"/>
+          <w:szCs w:val="22"/>
+        </w:rPr>
+        <w:t xml:space="preserve">Hand the draft to whoever shops. Collaborate.</w:t>
+      </w:r>
+    </w:p>
+    <w:p>
+      <w:pPr>
+        <w:pStyle w:val="ListParagraph"/>
+        <w:numPr>
+          <w:ilvl w:val="0"/>
+          <w:numId w:val="3"/>
+        </w:numPr>
+      </w:pPr>
+      <w:r>
+        <w:rPr>
+          <w:sz w:val="22"/>
+          <w:szCs w:val="22"/>
+        </w:rPr>
+        <w:t xml:space="preserve">Stock the pantry by Monday.</w:t>
+      </w:r>
+    </w:p>
+    <w:p>
+      <w:pPr>
+        <w:pStyle w:val="Heading3"/>
+      </w:pPr>
+      <w:r>
+        <w:t xml:space="preserve">Scripture sit</w:t>
+      </w:r>
+    </w:p>
+    <w:p>
+      <w:pPr>
+        <w:spacing w:after="120"/>
+      </w:pPr>
+      <w:r>
+        <w:rPr>
+          <w:i/>
+          <w:iCs/>
+          <w:color w:val="1A1A1A"/>
+          <w:sz w:val="22"/>
+          <w:szCs w:val="22"/>
+        </w:rPr>
+        <w:t xml:space="preserve">Proverbs 31:15 — A wise household plans meals.</w:t>
+      </w:r>
+    </w:p>
+    <w:p>
+      <w:r>
+        <w:br w:type="page"/>
+      </w:r>
+    </w:p>
+    <w:p>
+      <w:pPr>
+        <w:spacing w:after="60"/>
+      </w:pPr>
+      <w:r>
+        <w:rPr>
+          <w:b/>
+          <w:bCs/>
+          <w:color w:val="CE8E31"/>
+          <w:sz w:val="18"/>
+          <w:szCs w:val="18"/>
+        </w:rPr>
+        <w:t xml:space="preserve">WEEK 2 · TASK 3</w:t>
+      </w:r>
+    </w:p>
+    <w:p>
+      <w:pPr>
+        <w:pStyle w:val="Heading2"/>
+      </w:pPr>
+      <w:r>
+        <w:t xml:space="preserve">5-Night Sleep Audit</w:t>
+      </w:r>
+    </w:p>
+    <w:p>
+      <w:pPr>
+        <w:spacing w:after="120"/>
+      </w:pPr>
+      <w:r>
+        <w:rPr>
+          <w:i/>
+          <w:iCs/>
+          <w:color w:val="475569"/>
+          <w:sz w:val="22"/>
+          <w:szCs w:val="22"/>
+        </w:rPr>
+        <w:t xml:space="preserve">Log 5 nights. AI summarizes. Fix one variable next week.</w:t>
+      </w:r>
+    </w:p>
+    <w:p>
+      <w:pPr>
+        <w:pBdr>
+          <w:bottom w:val="single" w:color="CE8E31" w:sz="6" w:space="1"/>
+        </w:pBdr>
+        <w:spacing w:after="120"/>
+      </w:pPr>
+    </w:p>
+    <w:p>
+      <w:pPr>
+        <w:spacing w:after="120"/>
+      </w:pPr>
+      <w:r>
+        <w:rPr>
+          <w:color w:val="1A1A1A"/>
+          <w:sz w:val="22"/>
+          <w:szCs w:val="22"/>
+        </w:rPr>
+        <w:t xml:space="preserve">Sleep is leadership compounded. Diagnose by data, not by feeling.</w:t>
+      </w:r>
+    </w:p>
+    <w:p>
+      <w:pPr>
+        <w:pStyle w:val="Heading3"/>
+      </w:pPr>
+      <w:r>
+        <w:t xml:space="preserve">Action checklist</w:t>
+      </w:r>
+    </w:p>
+    <w:p>
+      <w:pPr>
+        <w:pStyle w:val="ListParagraph"/>
+        <w:numPr>
+          <w:ilvl w:val="0"/>
+          <w:numId w:val="3"/>
+        </w:numPr>
+      </w:pPr>
+      <w:r>
+        <w:rPr>
+          <w:sz w:val="22"/>
+          <w:szCs w:val="22"/>
+        </w:rPr>
+        <w:t xml:space="preserve">For 5 nights, log: bed time, wake time, caffeine cutoff, screen cutoff, stress 1-10, rested 1-10.</w:t>
+      </w:r>
+    </w:p>
+    <w:p>
+      <w:pPr>
+        <w:pStyle w:val="ListParagraph"/>
+        <w:numPr>
+          <w:ilvl w:val="0"/>
+          <w:numId w:val="3"/>
+        </w:numPr>
+      </w:pPr>
+      <w:r>
+        <w:rPr>
+          <w:sz w:val="22"/>
+          <w:szCs w:val="22"/>
+        </w:rPr>
+        <w:t xml:space="preserve">Saturday: paste all 5 nights into Claude. Ask for patterns and ONE variable to change.</w:t>
+      </w:r>
+    </w:p>
+    <w:p>
+      <w:pPr>
+        <w:pStyle w:val="ListParagraph"/>
+        <w:numPr>
+          <w:ilvl w:val="0"/>
+          <w:numId w:val="3"/>
+        </w:numPr>
+      </w:pPr>
+      <w:r>
+        <w:rPr>
+          <w:sz w:val="22"/>
+          <w:szCs w:val="22"/>
+        </w:rPr>
+        <w:t xml:space="preserve">Implement that one change next week. No others.</w:t>
+      </w:r>
+    </w:p>
+    <w:p>
+      <w:pPr>
+        <w:spacing w:after="120"/>
+      </w:pPr>
+      <w:r>
+        <w:t xml:space="preserve"/>
+      </w:r>
+    </w:p>
+    <w:tbl>
+      <w:tblPr>
+        <w:tblW w:type="dxa" w:w="9360"/>
+        <w:tblBorders>
+          <w:top w:val="single" w:color="auto" w:sz="4"/>
+          <w:left w:val="single" w:color="auto" w:sz="4"/>
+          <w:bottom w:val="single" w:color="auto" w:sz="4"/>
+          <w:right w:val="single" w:color="auto" w:sz="4"/>
+          <w:insideH w:val="single" w:color="auto" w:sz="4"/>
+          <w:insideV w:val="single" w:color="auto" w:sz="4"/>
+        </w:tblBorders>
+      </w:tblPr>
+      <w:tblGrid>
+        <w:gridCol w:w="9360"/>
+      </w:tblGrid>
+      <w:tr>
+        <w:tc>
+          <w:tcPr>
+            <w:tcW w:type="dxa" w:w="9360"/>
+            <w:tcBorders>
+              <w:top w:val="single" w:color="D1D5DB" w:sz="4"/>
+              <w:left w:val="single" w:color="1E293B" w:sz="24"/>
+              <w:bottom w:val="single" w:color="D1D5DB" w:sz="4"/>
+              <w:right w:val="single" w:color="D1D5DB" w:sz="4"/>
+            </w:tcBorders>
+            <w:shd w:fill="F4F5F7" w:val="clear"/>
+            <w:tcMar>
+              <w:top w:type="dxa" w:w="160"/>
+              <w:left w:type="dxa" w:w="240"/>
+              <w:bottom w:type="dxa" w:w="160"/>
+              <w:right w:type="dxa" w:w="240"/>
+            </w:tcMar>
+          </w:tcPr>
+          <w:p>
+            <w:pPr>
+              <w:spacing w:after="60"/>
+            </w:pPr>
+            <w:r>
+              <w:rPr>
+                <w:b/>
+                <w:bCs/>
+                <w:color w:val="CE8E31"/>
+                <w:sz w:val="18"/>
+                <w:szCs w:val="18"/>
+              </w:rPr>
+              <w:t xml:space="preserve">ONE VARIABLE</w:t>
+            </w:r>
+          </w:p>
+          <w:p>
+            <w:r>
+              <w:rPr>
+                <w:sz w:val="22"/>
+                <w:szCs w:val="22"/>
+              </w:rPr>
+              <w:t xml:space="preserve">Change five things at once and you'll know nothing. Change one and you'll know the truth in a week.</w:t>
+            </w:r>
+          </w:p>
+        </w:tc>
+      </w:tr>
+    </w:tbl>
+    <w:p>
+      <w:pPr>
+        <w:spacing w:after="120"/>
+      </w:pPr>
+      <w:r>
+        <w:t xml:space="preserve"/>
+      </w:r>
+    </w:p>
+    <w:p>
+      <w:pPr>
+        <w:pStyle w:val="Heading3"/>
+      </w:pPr>
+      <w:r>
+        <w:t xml:space="preserve">Scripture sit</w:t>
+      </w:r>
+    </w:p>
+    <w:p>
+      <w:pPr>
+        <w:spacing w:after="120"/>
+      </w:pPr>
+      <w:r>
+        <w:rPr>
+          <w:i/>
+          <w:iCs/>
+          <w:color w:val="1A1A1A"/>
+          <w:sz w:val="22"/>
+          <w:szCs w:val="22"/>
+        </w:rPr>
+        <w:t xml:space="preserve">Psalm 127:2 — He gives to his beloved sleep.</w:t>
+      </w:r>
+    </w:p>
+    <w:p>
+      <w:r>
+        <w:br w:type="page"/>
+      </w:r>
+    </w:p>
+    <w:p>
+      <w:pPr>
+        <w:spacing w:after="60"/>
+      </w:pPr>
+      <w:r>
+        <w:rPr>
+          <w:b/>
+          <w:bCs/>
+          <w:color w:val="CE8E31"/>
+          <w:sz w:val="18"/>
+          <w:szCs w:val="18"/>
+        </w:rPr>
+        <w:t xml:space="preserve">WEEK 3</w:t>
+      </w:r>
+    </w:p>
+    <w:p>
+      <w:pPr>
+        <w:pStyle w:val="Heading1"/>
+      </w:pPr>
+      <w:r>
+        <w:t xml:space="preserve">Spiritual</w:t>
+      </w:r>
+    </w:p>
+    <w:p>
+      <w:pPr>
+        <w:spacing w:after="120"/>
+      </w:pPr>
+      <w:r>
+        <w:rPr>
+          <w:i/>
+          <w:iCs/>
+          <w:color w:val="475569"/>
+          <w:sz w:val="22"/>
+          <w:szCs w:val="22"/>
+        </w:rPr>
+        <w:t xml:space="preserve">Walk with God. The captain's command flows from his communion.</w:t>
+      </w:r>
+    </w:p>
+    <w:p>
+      <w:pPr>
+        <w:pBdr>
+          <w:bottom w:val="single" w:color="CE8E31" w:sz="6" w:space="1"/>
+        </w:pBdr>
+        <w:spacing w:after="120"/>
+      </w:pPr>
+    </w:p>
+    <w:p>
+      <w:pPr>
+        <w:spacing w:after="120"/>
+      </w:pPr>
+      <w:r>
+        <w:rPr>
+          <w:color w:val="1A1A1A"/>
+          <w:sz w:val="22"/>
+          <w:szCs w:val="22"/>
+        </w:rPr>
+        <w:t xml:space="preserve">A captain who outsources prayer becomes the manager of his soul. AI is a remarkable research assistant. It is not a pastor, not the Spirit, not your prayer life. This week, you sharpen the line between tool and teacher — and you do not blur it. You lead a Scripture study yourself; AI just hands you the reference.</w:t>
+      </w:r>
+    </w:p>
+    <w:p>
+      <w:pPr>
+        <w:pStyle w:val="Heading3"/>
+      </w:pPr>
+      <w:r>
+        <w:t xml:space="preserve">Scripture anchor</w:t>
+      </w:r>
+    </w:p>
+    <w:p>
+      <w:pPr>
+        <w:spacing w:after="120"/>
+      </w:pPr>
+      <w:r>
+        <w:rPr>
+          <w:i/>
+          <w:iCs/>
+          <w:color w:val="1A1A1A"/>
+          <w:sz w:val="22"/>
+          <w:szCs w:val="22"/>
+        </w:rPr>
+        <w:t xml:space="preserve">"This Book of the Law shall not depart from your mouth, but you shall meditate on it day and night."</w:t>
+      </w:r>
+    </w:p>
+    <w:p>
+      <w:pPr>
+        <w:spacing w:after="200"/>
+      </w:pPr>
+      <w:r>
+        <w:rPr>
+          <w:color w:val="6B7280"/>
+          <w:sz w:val="20"/>
+          <w:szCs w:val="20"/>
+        </w:rPr>
+        <w:t xml:space="preserve">— Joshua 1:8</w:t>
+      </w:r>
+    </w:p>
+    <w:p>
+      <w:r>
+        <w:br w:type="page"/>
+      </w:r>
+    </w:p>
+    <w:p>
+      <w:pPr>
+        <w:spacing w:after="60"/>
+      </w:pPr>
+      <w:r>
+        <w:rPr>
+          <w:b/>
+          <w:bCs/>
+          <w:color w:val="CE8E31"/>
+          <w:sz w:val="18"/>
+          <w:szCs w:val="18"/>
+        </w:rPr>
+        <w:t xml:space="preserve">WEEK 3 · TASK 1</w:t>
+      </w:r>
+    </w:p>
+    <w:p>
+      <w:pPr>
+        <w:pStyle w:val="Heading2"/>
+      </w:pPr>
+      <w:r>
+        <w:t xml:space="preserve">10-Min Scripture Study, You Lead</w:t>
+      </w:r>
+    </w:p>
+    <w:p>
+      <w:pPr>
+        <w:spacing w:after="120"/>
+      </w:pPr>
+      <w:r>
+        <w:rPr>
+          <w:i/>
+          <w:iCs/>
+          <w:color w:val="475569"/>
+          <w:sz w:val="22"/>
+          <w:szCs w:val="22"/>
+        </w:rPr>
+        <w:t xml:space="preserve">Claude is a study partner. Not a commentary. Not a pastor.</w:t>
+      </w:r>
+    </w:p>
+    <w:p>
+      <w:pPr>
+        <w:pBdr>
+          <w:bottom w:val="single" w:color="CE8E31" w:sz="6" w:space="1"/>
+        </w:pBdr>
+        <w:spacing w:after="120"/>
+      </w:pPr>
+    </w:p>
+    <w:p>
+      <w:pPr>
+        <w:spacing w:after="120"/>
+      </w:pPr>
+      <w:r>
+        <w:rPr>
+          <w:color w:val="1A1A1A"/>
+          <w:sz w:val="22"/>
+          <w:szCs w:val="22"/>
+        </w:rPr>
+        <w:t xml:space="preserve">Most men outsource Bible study to a pastor. Flip that. You pick the passage. You ask the questions.</w:t>
+      </w:r>
+    </w:p>
+    <w:p>
+      <w:pPr>
+        <w:pStyle w:val="Heading3"/>
+      </w:pPr>
+      <w:r>
+        <w:t xml:space="preserve">Action checklist</w:t>
+      </w:r>
+    </w:p>
+    <w:p>
+      <w:pPr>
+        <w:pStyle w:val="ListParagraph"/>
+        <w:numPr>
+          <w:ilvl w:val="0"/>
+          <w:numId w:val="3"/>
+        </w:numPr>
+      </w:pPr>
+      <w:r>
+        <w:rPr>
+          <w:sz w:val="22"/>
+          <w:szCs w:val="22"/>
+        </w:rPr>
+        <w:t xml:space="preserve">Pick a short passage. Read it aloud, slowly, twice. No screens.</w:t>
+      </w:r>
+    </w:p>
+    <w:p>
+      <w:pPr>
+        <w:pStyle w:val="ListParagraph"/>
+        <w:numPr>
+          <w:ilvl w:val="0"/>
+          <w:numId w:val="3"/>
+        </w:numPr>
+      </w:pPr>
+      <w:r>
+        <w:rPr>
+          <w:sz w:val="22"/>
+          <w:szCs w:val="22"/>
+        </w:rPr>
+        <w:t xml:space="preserve">Open Claude. Use it ONLY for context, cross-references, original-language word notes.</w:t>
+      </w:r>
+    </w:p>
+    <w:p>
+      <w:pPr>
+        <w:pStyle w:val="ListParagraph"/>
+        <w:numPr>
+          <w:ilvl w:val="0"/>
+          <w:numId w:val="3"/>
+        </w:numPr>
+      </w:pPr>
+      <w:r>
+        <w:rPr>
+          <w:sz w:val="22"/>
+          <w:szCs w:val="22"/>
+        </w:rPr>
+        <w:t xml:space="preserve">DO NOT ask Claude what it means for your life.</w:t>
+      </w:r>
+    </w:p>
+    <w:p>
+      <w:pPr>
+        <w:pStyle w:val="ListParagraph"/>
+        <w:numPr>
+          <w:ilvl w:val="0"/>
+          <w:numId w:val="3"/>
+        </w:numPr>
+      </w:pPr>
+      <w:r>
+        <w:rPr>
+          <w:sz w:val="22"/>
+          <w:szCs w:val="22"/>
+        </w:rPr>
+        <w:t xml:space="preserve">Write your own one-sentence application.</w:t>
+      </w:r>
+    </w:p>
+    <w:p>
+      <w:pPr>
+        <w:spacing w:after="120"/>
+      </w:pPr>
+      <w:r>
+        <w:t xml:space="preserve"/>
+      </w:r>
+    </w:p>
+    <w:tbl>
+      <w:tblPr>
+        <w:tblW w:type="dxa" w:w="9360"/>
+        <w:tblBorders>
+          <w:top w:val="single" w:color="auto" w:sz="4"/>
+          <w:left w:val="single" w:color="auto" w:sz="4"/>
+          <w:bottom w:val="single" w:color="auto" w:sz="4"/>
+          <w:right w:val="single" w:color="auto" w:sz="4"/>
+          <w:insideH w:val="single" w:color="auto" w:sz="4"/>
+          <w:insideV w:val="single" w:color="auto" w:sz="4"/>
+        </w:tblBorders>
+      </w:tblPr>
+      <w:tblGrid>
+        <w:gridCol w:w="9360"/>
+      </w:tblGrid>
+      <w:tr>
+        <w:tc>
+          <w:tcPr>
+            <w:tcW w:type="dxa" w:w="9360"/>
+            <w:tcBorders>
+              <w:top w:val="single" w:color="D1D5DB" w:sz="4"/>
+              <w:left w:val="single" w:color="1E293B" w:sz="24"/>
+              <w:bottom w:val="single" w:color="D1D5DB" w:sz="4"/>
+              <w:right w:val="single" w:color="D1D5DB" w:sz="4"/>
+            </w:tcBorders>
+            <w:shd w:fill="F4F5F7" w:val="clear"/>
+            <w:tcMar>
+              <w:top w:type="dxa" w:w="160"/>
+              <w:left w:type="dxa" w:w="240"/>
+              <w:bottom w:type="dxa" w:w="160"/>
+              <w:right w:type="dxa" w:w="240"/>
+            </w:tcMar>
+          </w:tcPr>
+          <w:p>
+            <w:pPr>
+              <w:spacing w:after="60"/>
+            </w:pPr>
+            <w:r>
+              <w:rPr>
+                <w:b/>
+                <w:bCs/>
+                <w:color w:val="CE8E31"/>
+                <w:sz w:val="18"/>
+                <w:szCs w:val="18"/>
+              </w:rPr>
+              <w:t xml:space="preserve">THE LINE</w:t>
+            </w:r>
+          </w:p>
+          <w:p>
+            <w:r>
+              <w:rPr>
+                <w:sz w:val="22"/>
+                <w:szCs w:val="22"/>
+              </w:rPr>
+              <w:t xml:space="preserve">AI is a research partner. The Spirit is the teacher. Confuse the two and you'll trade communion for content.</w:t>
+            </w:r>
+          </w:p>
+        </w:tc>
+      </w:tr>
+    </w:tbl>
+    <w:p>
+      <w:pPr>
+        <w:spacing w:after="120"/>
+      </w:pPr>
+      <w:r>
+        <w:t xml:space="preserve"/>
+      </w:r>
+    </w:p>
+    <w:p>
+      <w:pPr>
+        <w:pStyle w:val="Heading3"/>
+      </w:pPr>
+      <w:r>
+        <w:t xml:space="preserve">Scripture sit</w:t>
+      </w:r>
+    </w:p>
+    <w:p>
+      <w:pPr>
+        <w:spacing w:after="120"/>
+      </w:pPr>
+      <w:r>
+        <w:rPr>
+          <w:i/>
+          <w:iCs/>
+          <w:color w:val="1A1A1A"/>
+          <w:sz w:val="22"/>
+          <w:szCs w:val="22"/>
+        </w:rPr>
+        <w:t xml:space="preserve">Joshua 1:8 — Meditate on it day and night.</w:t>
+      </w:r>
+    </w:p>
+    <w:p>
+      <w:r>
+        <w:br w:type="page"/>
+      </w:r>
+    </w:p>
+    <w:p>
+      <w:pPr>
+        <w:spacing w:after="60"/>
+      </w:pPr>
+      <w:r>
+        <w:rPr>
+          <w:b/>
+          <w:bCs/>
+          <w:color w:val="CE8E31"/>
+          <w:sz w:val="18"/>
+          <w:szCs w:val="18"/>
+        </w:rPr>
+        <w:t xml:space="preserve">WEEK 3 · TASK 2</w:t>
+      </w:r>
+    </w:p>
+    <w:p>
+      <w:pPr>
+        <w:pStyle w:val="Heading2"/>
+      </w:pPr>
+      <w:r>
+        <w:t xml:space="preserve">Family Devotion Generator</w:t>
+      </w:r>
+    </w:p>
+    <w:p>
+      <w:pPr>
+        <w:spacing w:after="120"/>
+      </w:pPr>
+      <w:r>
+        <w:rPr>
+          <w:i/>
+          <w:iCs/>
+          <w:color w:val="475569"/>
+          <w:sz w:val="22"/>
+          <w:szCs w:val="22"/>
+        </w:rPr>
+        <w:t xml:space="preserve">Friday-night devo, built from Sunday's sermon. 10 minutes.</w:t>
+      </w:r>
+    </w:p>
+    <w:p>
+      <w:pPr>
+        <w:pBdr>
+          <w:bottom w:val="single" w:color="CE8E31" w:sz="6" w:space="1"/>
+        </w:pBdr>
+        <w:spacing w:after="120"/>
+      </w:pPr>
+    </w:p>
+    <w:p>
+      <w:pPr>
+        <w:spacing w:after="120"/>
+      </w:pPr>
+      <w:r>
+        <w:rPr>
+          <w:color w:val="1A1A1A"/>
+          <w:sz w:val="22"/>
+          <w:szCs w:val="22"/>
+        </w:rPr>
+        <w:t xml:space="preserve">Family devotion lives or dies on the captain's preparation. AI compresses 30 minutes of prep to 5.</w:t>
+      </w:r>
+    </w:p>
+    <w:p>
+      <w:pPr>
+        <w:pStyle w:val="Heading3"/>
+      </w:pPr>
+      <w:r>
+        <w:t xml:space="preserve">Action checklist</w:t>
+      </w:r>
+    </w:p>
+    <w:p>
+      <w:pPr>
+        <w:pStyle w:val="ListParagraph"/>
+        <w:numPr>
+          <w:ilvl w:val="0"/>
+          <w:numId w:val="3"/>
+        </w:numPr>
+      </w:pPr>
+      <w:r>
+        <w:rPr>
+          <w:sz w:val="22"/>
+          <w:szCs w:val="22"/>
+        </w:rPr>
+        <w:t xml:space="preserve">Paste this Sunday's sermon notes (or a passage you're sitting in) into Claude.</w:t>
+      </w:r>
+    </w:p>
+    <w:p>
+      <w:pPr>
+        <w:pStyle w:val="ListParagraph"/>
+        <w:numPr>
+          <w:ilvl w:val="0"/>
+          <w:numId w:val="3"/>
+        </w:numPr>
+      </w:pPr>
+      <w:r>
+        <w:rPr>
+          <w:sz w:val="22"/>
+          <w:szCs w:val="22"/>
+        </w:rPr>
+        <w:t xml:space="preserve">Ask for: one key verse to read aloud, one short illustration, one question per kid (by age), one prayer prompt.</w:t>
+      </w:r>
+    </w:p>
+    <w:p>
+      <w:pPr>
+        <w:pStyle w:val="ListParagraph"/>
+        <w:numPr>
+          <w:ilvl w:val="0"/>
+          <w:numId w:val="3"/>
+        </w:numPr>
+      </w:pPr>
+      <w:r>
+        <w:rPr>
+          <w:sz w:val="22"/>
+          <w:szCs w:val="22"/>
+        </w:rPr>
+        <w:t xml:space="preserve">Cut anything that doesn't sound like you.</w:t>
+      </w:r>
+    </w:p>
+    <w:p>
+      <w:pPr>
+        <w:pStyle w:val="ListParagraph"/>
+        <w:numPr>
+          <w:ilvl w:val="0"/>
+          <w:numId w:val="3"/>
+        </w:numPr>
+      </w:pPr>
+      <w:r>
+        <w:rPr>
+          <w:sz w:val="22"/>
+          <w:szCs w:val="22"/>
+        </w:rPr>
+        <w:t xml:space="preserve">Run it Friday night. Take notes on what worked.</w:t>
+      </w:r>
+    </w:p>
+    <w:p>
+      <w:pPr>
+        <w:pStyle w:val="Heading3"/>
+      </w:pPr>
+      <w:r>
+        <w:t xml:space="preserve">Scripture sit</w:t>
+      </w:r>
+    </w:p>
+    <w:p>
+      <w:pPr>
+        <w:spacing w:after="120"/>
+      </w:pPr>
+      <w:r>
+        <w:rPr>
+          <w:i/>
+          <w:iCs/>
+          <w:color w:val="1A1A1A"/>
+          <w:sz w:val="22"/>
+          <w:szCs w:val="22"/>
+        </w:rPr>
+        <w:t xml:space="preserve">Psalm 78:4 — Tell to the coming generation the glorious deeds of the LORD.</w:t>
+      </w:r>
+    </w:p>
+    <w:p>
+      <w:r>
+        <w:br w:type="page"/>
+      </w:r>
+    </w:p>
+    <w:p>
+      <w:pPr>
+        <w:spacing w:after="60"/>
+      </w:pPr>
+      <w:r>
+        <w:rPr>
+          <w:b/>
+          <w:bCs/>
+          <w:color w:val="CE8E31"/>
+          <w:sz w:val="18"/>
+          <w:szCs w:val="18"/>
+        </w:rPr>
+        <w:t xml:space="preserve">WEEK 3 · TASK 3</w:t>
+      </w:r>
+    </w:p>
+    <w:p>
+      <w:pPr>
+        <w:pStyle w:val="Heading2"/>
+      </w:pPr>
+      <w:r>
+        <w:t xml:space="preserve">Sermon Notes → Captain's Actions</w:t>
+      </w:r>
+    </w:p>
+    <w:p>
+      <w:pPr>
+        <w:spacing w:after="120"/>
+      </w:pPr>
+      <w:r>
+        <w:rPr>
+          <w:i/>
+          <w:iCs/>
+          <w:color w:val="475569"/>
+          <w:sz w:val="22"/>
+          <w:szCs w:val="22"/>
+        </w:rPr>
+        <w:t xml:space="preserve">Five actions from a sermon you sat under. Do one today.</w:t>
+      </w:r>
+    </w:p>
+    <w:p>
+      <w:pPr>
+        <w:pBdr>
+          <w:bottom w:val="single" w:color="CE8E31" w:sz="6" w:space="1"/>
+        </w:pBdr>
+        <w:spacing w:after="120"/>
+      </w:pPr>
+    </w:p>
+    <w:p>
+      <w:pPr>
+        <w:spacing w:after="120"/>
+      </w:pPr>
+      <w:r>
+        <w:rPr>
+          <w:color w:val="1A1A1A"/>
+          <w:sz w:val="22"/>
+          <w:szCs w:val="22"/>
+        </w:rPr>
+        <w:t xml:space="preserve">Most men leave church with an emotion. Captains leave with a list. Convert the last sermon you heard into five things you actually do this week.</w:t>
+      </w:r>
+    </w:p>
+    <w:p>
+      <w:pPr>
+        <w:pStyle w:val="Heading3"/>
+      </w:pPr>
+      <w:r>
+        <w:t xml:space="preserve">Action checklist</w:t>
+      </w:r>
+    </w:p>
+    <w:p>
+      <w:pPr>
+        <w:pStyle w:val="ListParagraph"/>
+        <w:numPr>
+          <w:ilvl w:val="0"/>
+          <w:numId w:val="3"/>
+        </w:numPr>
+      </w:pPr>
+      <w:r>
+        <w:rPr>
+          <w:sz w:val="22"/>
+          <w:szCs w:val="22"/>
+        </w:rPr>
+        <w:t xml:space="preserve">Pull up your notes from a recent sermon (Sunday, a podcast, or a recorded message).</w:t>
+      </w:r>
+    </w:p>
+    <w:p>
+      <w:pPr>
+        <w:pStyle w:val="ListParagraph"/>
+        <w:numPr>
+          <w:ilvl w:val="0"/>
+          <w:numId w:val="3"/>
+        </w:numPr>
+      </w:pPr>
+      <w:r>
+        <w:rPr>
+          <w:sz w:val="22"/>
+          <w:szCs w:val="22"/>
+        </w:rPr>
+        <w:t xml:space="preserve">Open Claude. Paste or transcribe the key points.</w:t>
+      </w:r>
+    </w:p>
+    <w:p>
+      <w:pPr>
+        <w:pStyle w:val="ListParagraph"/>
+        <w:numPr>
+          <w:ilvl w:val="0"/>
+          <w:numId w:val="3"/>
+        </w:numPr>
+      </w:pPr>
+      <w:r>
+        <w:rPr>
+          <w:sz w:val="22"/>
+          <w:szCs w:val="22"/>
+        </w:rPr>
+        <w:t xml:space="preserve">Ask: "Pull 5 specific, concrete actions a husband and father should take this week from this sermon."</w:t>
+      </w:r>
+    </w:p>
+    <w:p>
+      <w:pPr>
+        <w:pStyle w:val="ListParagraph"/>
+        <w:numPr>
+          <w:ilvl w:val="0"/>
+          <w:numId w:val="3"/>
+        </w:numPr>
+      </w:pPr>
+      <w:r>
+        <w:rPr>
+          <w:sz w:val="22"/>
+          <w:szCs w:val="22"/>
+        </w:rPr>
+        <w:t xml:space="preserve">Pick ONE. Do it today. Track the other 4 across the week.</w:t>
+      </w:r>
+    </w:p>
+    <w:p>
+      <w:pPr>
+        <w:spacing w:after="120"/>
+      </w:pPr>
+      <w:r>
+        <w:t xml:space="preserve"/>
+      </w:r>
+    </w:p>
+    <w:tbl>
+      <w:tblPr>
+        <w:tblW w:type="dxa" w:w="9360"/>
+        <w:tblBorders>
+          <w:top w:val="single" w:color="auto" w:sz="4"/>
+          <w:left w:val="single" w:color="auto" w:sz="4"/>
+          <w:bottom w:val="single" w:color="auto" w:sz="4"/>
+          <w:right w:val="single" w:color="auto" w:sz="4"/>
+          <w:insideH w:val="single" w:color="auto" w:sz="4"/>
+          <w:insideV w:val="single" w:color="auto" w:sz="4"/>
+        </w:tblBorders>
+      </w:tblPr>
+      <w:tblGrid>
+        <w:gridCol w:w="9360"/>
+      </w:tblGrid>
+      <w:tr>
+        <w:tc>
+          <w:tcPr>
+            <w:tcW w:type="dxa" w:w="9360"/>
+            <w:tcBorders>
+              <w:top w:val="single" w:color="D1D5DB" w:sz="4"/>
+              <w:left w:val="single" w:color="1E293B" w:sz="24"/>
+              <w:bottom w:val="single" w:color="D1D5DB" w:sz="4"/>
+              <w:right w:val="single" w:color="D1D5DB" w:sz="4"/>
+            </w:tcBorders>
+            <w:shd w:fill="F4F5F7" w:val="clear"/>
+            <w:tcMar>
+              <w:top w:type="dxa" w:w="160"/>
+              <w:left w:type="dxa" w:w="240"/>
+              <w:bottom w:type="dxa" w:w="160"/>
+              <w:right w:type="dxa" w:w="240"/>
+            </w:tcMar>
+          </w:tcPr>
+          <w:p>
+            <w:pPr>
+              <w:spacing w:after="60"/>
+            </w:pPr>
+            <w:r>
+              <w:rPr>
+                <w:b/>
+                <w:bCs/>
+                <w:color w:val="CE8E31"/>
+                <w:sz w:val="18"/>
+                <w:szCs w:val="18"/>
+              </w:rPr>
+              <w:t xml:space="preserve">IF YOU DON'T TAKE NOTES</w:t>
+            </w:r>
+          </w:p>
+          <w:p>
+            <w:r>
+              <w:rPr>
+                <w:sz w:val="22"/>
+                <w:szCs w:val="22"/>
+              </w:rPr>
+              <w:t xml:space="preserve">That's task 0: start now. A captain who can't quote his pastor by Tuesday has wasted Sunday.</w:t>
+            </w:r>
+          </w:p>
+        </w:tc>
+      </w:tr>
+    </w:tbl>
+    <w:p>
+      <w:pPr>
+        <w:spacing w:after="120"/>
+      </w:pPr>
+      <w:r>
+        <w:t xml:space="preserve"/>
+      </w:r>
+    </w:p>
+    <w:p>
+      <w:pPr>
+        <w:pStyle w:val="Heading3"/>
+      </w:pPr>
+      <w:r>
+        <w:t xml:space="preserve">Scripture sit</w:t>
+      </w:r>
+    </w:p>
+    <w:p>
+      <w:pPr>
+        <w:spacing w:after="120"/>
+      </w:pPr>
+      <w:r>
+        <w:rPr>
+          <w:i/>
+          <w:iCs/>
+          <w:color w:val="1A1A1A"/>
+          <w:sz w:val="22"/>
+          <w:szCs w:val="22"/>
+        </w:rPr>
+        <w:t xml:space="preserve">James 1:22 — Be doers of the word, and not hearers only.</w:t>
+      </w:r>
+    </w:p>
+    <w:p>
+      <w:r>
+        <w:br w:type="page"/>
+      </w:r>
+    </w:p>
+    <w:p>
+      <w:pPr>
+        <w:spacing w:after="60"/>
+      </w:pPr>
+      <w:r>
+        <w:rPr>
+          <w:b/>
+          <w:bCs/>
+          <w:color w:val="CE8E31"/>
+          <w:sz w:val="18"/>
+          <w:szCs w:val="18"/>
+        </w:rPr>
+        <w:t xml:space="preserve">WEEK 4</w:t>
+      </w:r>
+    </w:p>
+    <w:p>
+      <w:pPr>
+        <w:pStyle w:val="Heading1"/>
+      </w:pPr>
+      <w:r>
+        <w:t xml:space="preserve">Husbanding</w:t>
+      </w:r>
+    </w:p>
+    <w:p>
+      <w:pPr>
+        <w:spacing w:after="120"/>
+      </w:pPr>
+      <w:r>
+        <w:rPr>
+          <w:i/>
+          <w:iCs/>
+          <w:color w:val="475569"/>
+          <w:sz w:val="22"/>
+          <w:szCs w:val="22"/>
+        </w:rPr>
+        <w:t xml:space="preserve">Lead with love. The captain's first crew is one woman.</w:t>
+      </w:r>
+    </w:p>
+    <w:p>
+      <w:pPr>
+        <w:pBdr>
+          <w:bottom w:val="single" w:color="CE8E31" w:sz="6" w:space="1"/>
+        </w:pBdr>
+        <w:spacing w:after="120"/>
+      </w:pPr>
+    </w:p>
+    <w:p>
+      <w:pPr>
+        <w:spacing w:after="120"/>
+      </w:pPr>
+      <w:r>
+        <w:rPr>
+          <w:color w:val="1A1A1A"/>
+          <w:sz w:val="22"/>
+          <w:szCs w:val="22"/>
+        </w:rPr>
+        <w:t xml:space="preserve">Vision, strength, and a steady walk with God converge here: a man who can love the woman in his house well. This week is not about romance. It's about leadership in the home that the world never sees but the next generation feels for forty years.</w:t>
+      </w:r>
+    </w:p>
+    <w:p>
+      <w:pPr>
+        <w:pStyle w:val="Heading3"/>
+      </w:pPr>
+      <w:r>
+        <w:t xml:space="preserve">Scripture anchor</w:t>
+      </w:r>
+    </w:p>
+    <w:p>
+      <w:pPr>
+        <w:spacing w:after="120"/>
+      </w:pPr>
+      <w:r>
+        <w:rPr>
+          <w:i/>
+          <w:iCs/>
+          <w:color w:val="1A1A1A"/>
+          <w:sz w:val="22"/>
+          <w:szCs w:val="22"/>
+        </w:rPr>
+        <w:t xml:space="preserve">"Husbands, love your wives, as Christ loved the church and gave himself up for her."</w:t>
+      </w:r>
+    </w:p>
+    <w:p>
+      <w:pPr>
+        <w:spacing w:after="200"/>
+      </w:pPr>
+      <w:r>
+        <w:rPr>
+          <w:color w:val="6B7280"/>
+          <w:sz w:val="20"/>
+          <w:szCs w:val="20"/>
+        </w:rPr>
+        <w:t xml:space="preserve">— Ephesians 5:25-28</w:t>
+      </w:r>
+    </w:p>
+    <w:p>
+      <w:r>
+        <w:br w:type="page"/>
+      </w:r>
+    </w:p>
+    <w:p>
+      <w:pPr>
+        <w:spacing w:after="60"/>
+      </w:pPr>
+      <w:r>
+        <w:rPr>
+          <w:b/>
+          <w:bCs/>
+          <w:color w:val="CE8E31"/>
+          <w:sz w:val="18"/>
+          <w:szCs w:val="18"/>
+        </w:rPr>
+        <w:t xml:space="preserve">WEEK 4 · TASK 1</w:t>
       </w:r>
     </w:p>
     <w:p>
@@ -1678,7 +3120,7 @@
           <w:sz w:val="18"/>
           <w:szCs w:val="18"/>
         </w:rPr>
-        <w:t xml:space="preserve">WEEK 2 · TASK 2</w:t>
+        <w:t xml:space="preserve">WEEK 4 · TASK 2</w:t>
       </w:r>
     </w:p>
     <w:p>
@@ -1897,7 +3339,7 @@
           <w:sz w:val="18"/>
           <w:szCs w:val="18"/>
         </w:rPr>
-        <w:t xml:space="preserve">WEEK 2 · TASK 3</w:t>
+        <w:t xml:space="preserve">WEEK 4 · TASK 3</w:t>
       </w:r>
     </w:p>
     <w:p>
@@ -2132,7 +3574,7 @@
           <w:sz w:val="18"/>
           <w:szCs w:val="18"/>
         </w:rPr>
-        <w:t xml:space="preserve">WEEK 3</w:t>
+        <w:t xml:space="preserve">WEEK 5</w:t>
       </w:r>
     </w:p>
     <w:p>
@@ -2232,7 +3674,7 @@
           <w:sz w:val="18"/>
           <w:szCs w:val="18"/>
         </w:rPr>
-        <w:t xml:space="preserve">WEEK 3 · TASK 1</w:t>
+        <w:t xml:space="preserve">WEEK 5 · TASK 1</w:t>
       </w:r>
     </w:p>
     <w:p>
@@ -2467,7 +3909,7 @@
           <w:sz w:val="18"/>
           <w:szCs w:val="18"/>
         </w:rPr>
-        <w:t xml:space="preserve">WEEK 3 · TASK 2</w:t>
+        <w:t xml:space="preserve">WEEK 5 · TASK 2</w:t>
       </w:r>
     </w:p>
     <w:p>
@@ -2626,7 +4068,7 @@
           <w:sz w:val="18"/>
           <w:szCs w:val="18"/>
         </w:rPr>
-        <w:t xml:space="preserve">WEEK 3 · TASK 3</w:t>
+        <w:t xml:space="preserve">WEEK 5 · TASK 3</w:t>
       </w:r>
     </w:p>
     <w:p>
@@ -2861,7 +4303,7 @@
           <w:sz w:val="18"/>
           <w:szCs w:val="18"/>
         </w:rPr>
-        <w:t xml:space="preserve">WEEK 4</w:t>
+        <w:t xml:space="preserve">WEEK 6</w:t>
       </w:r>
     </w:p>
     <w:p>
@@ -2869,1449 +4311,7 @@
         <w:pStyle w:val="Heading1"/>
       </w:pPr>
       <w:r>
-        <w:t xml:space="preserve">Spiritual</w:t>
-      </w:r>
-    </w:p>
-    <w:p>
-      <w:pPr>
-        <w:spacing w:after="120"/>
-      </w:pPr>
-      <w:r>
-        <w:rPr>
-          <w:i/>
-          <w:iCs/>
-          <w:color w:val="475569"/>
-          <w:sz w:val="22"/>
-          <w:szCs w:val="22"/>
-        </w:rPr>
-        <w:t xml:space="preserve">Walk with God. The captain's command flows from his communion.</w:t>
-      </w:r>
-    </w:p>
-    <w:p>
-      <w:pPr>
-        <w:pBdr>
-          <w:bottom w:val="single" w:color="CE8E31" w:sz="6" w:space="1"/>
-        </w:pBdr>
-        <w:spacing w:after="120"/>
-      </w:pPr>
-    </w:p>
-    <w:p>
-      <w:pPr>
-        <w:spacing w:after="120"/>
-      </w:pPr>
-      <w:r>
-        <w:rPr>
-          <w:color w:val="1A1A1A"/>
-          <w:sz w:val="22"/>
-          <w:szCs w:val="22"/>
-        </w:rPr>
-        <w:t xml:space="preserve">A captain who outsources prayer becomes the manager of his soul. AI is a remarkable research assistant. It is not a pastor, not the Spirit, not your prayer life. This week, you sharpen the line between tool and teacher — and you do not blur it.</w:t>
-      </w:r>
-    </w:p>
-    <w:p>
-      <w:pPr>
-        <w:pStyle w:val="Heading3"/>
-      </w:pPr>
-      <w:r>
-        <w:t xml:space="preserve">Scripture anchor</w:t>
-      </w:r>
-    </w:p>
-    <w:p>
-      <w:pPr>
-        <w:spacing w:after="120"/>
-      </w:pPr>
-      <w:r>
-        <w:rPr>
-          <w:i/>
-          <w:iCs/>
-          <w:color w:val="1A1A1A"/>
-          <w:sz w:val="22"/>
-          <w:szCs w:val="22"/>
-        </w:rPr>
-        <w:t xml:space="preserve">"This Book of the Law shall not depart from your mouth, but you shall meditate on it day and night."</w:t>
-      </w:r>
-    </w:p>
-    <w:p>
-      <w:pPr>
-        <w:spacing w:after="200"/>
-      </w:pPr>
-      <w:r>
-        <w:rPr>
-          <w:color w:val="6B7280"/>
-          <w:sz w:val="20"/>
-          <w:szCs w:val="20"/>
-        </w:rPr>
-        <w:t xml:space="preserve">— Joshua 1:8</w:t>
-      </w:r>
-    </w:p>
-    <w:p>
-      <w:r>
-        <w:br w:type="page"/>
-      </w:r>
-    </w:p>
-    <w:p>
-      <w:pPr>
-        <w:spacing w:after="60"/>
-      </w:pPr>
-      <w:r>
-        <w:rPr>
-          <w:b/>
-          <w:bCs/>
-          <w:color w:val="CE8E31"/>
-          <w:sz w:val="18"/>
-          <w:szCs w:val="18"/>
-        </w:rPr>
-        <w:t xml:space="preserve">WEEK 4 · TASK 1</w:t>
-      </w:r>
-    </w:p>
-    <w:p>
-      <w:pPr>
-        <w:pStyle w:val="Heading2"/>
-      </w:pPr>
-      <w:r>
-        <w:t xml:space="preserve">Sermon Notes → Captain's Actions</w:t>
-      </w:r>
-    </w:p>
-    <w:p>
-      <w:pPr>
-        <w:spacing w:after="120"/>
-      </w:pPr>
-      <w:r>
-        <w:rPr>
-          <w:i/>
-          <w:iCs/>
-          <w:color w:val="475569"/>
-          <w:sz w:val="22"/>
-          <w:szCs w:val="22"/>
-        </w:rPr>
-        <w:t xml:space="preserve">Five actions from Sunday's sermon. Do one today.</w:t>
-      </w:r>
-    </w:p>
-    <w:p>
-      <w:pPr>
-        <w:pBdr>
-          <w:bottom w:val="single" w:color="CE8E31" w:sz="6" w:space="1"/>
-        </w:pBdr>
-        <w:spacing w:after="120"/>
-      </w:pPr>
-    </w:p>
-    <w:p>
-      <w:pPr>
-        <w:spacing w:after="120"/>
-      </w:pPr>
-      <w:r>
-        <w:rPr>
-          <w:color w:val="1A1A1A"/>
-          <w:sz w:val="22"/>
-          <w:szCs w:val="22"/>
-        </w:rPr>
-        <w:t xml:space="preserve">Most men leave church with an emotion. Captains leave with a list.</w:t>
-      </w:r>
-    </w:p>
-    <w:p>
-      <w:pPr>
-        <w:pStyle w:val="Heading3"/>
-      </w:pPr>
-      <w:r>
-        <w:t xml:space="preserve">Action checklist</w:t>
-      </w:r>
-    </w:p>
-    <w:p>
-      <w:pPr>
-        <w:pStyle w:val="ListParagraph"/>
-        <w:numPr>
-          <w:ilvl w:val="0"/>
-          <w:numId w:val="3"/>
-        </w:numPr>
-      </w:pPr>
-      <w:r>
-        <w:rPr>
-          <w:sz w:val="22"/>
-          <w:szCs w:val="22"/>
-        </w:rPr>
-        <w:t xml:space="preserve">Pull up your notes from last Sunday's sermon.</w:t>
-      </w:r>
-    </w:p>
-    <w:p>
-      <w:pPr>
-        <w:pStyle w:val="ListParagraph"/>
-        <w:numPr>
-          <w:ilvl w:val="0"/>
-          <w:numId w:val="3"/>
-        </w:numPr>
-      </w:pPr>
-      <w:r>
-        <w:rPr>
-          <w:sz w:val="22"/>
-          <w:szCs w:val="22"/>
-        </w:rPr>
-        <w:t xml:space="preserve">Open Claude. Paste the key points.</w:t>
-      </w:r>
-    </w:p>
-    <w:p>
-      <w:pPr>
-        <w:pStyle w:val="ListParagraph"/>
-        <w:numPr>
-          <w:ilvl w:val="0"/>
-          <w:numId w:val="3"/>
-        </w:numPr>
-      </w:pPr>
-      <w:r>
-        <w:rPr>
-          <w:sz w:val="22"/>
-          <w:szCs w:val="22"/>
-        </w:rPr>
-        <w:t xml:space="preserve">Ask: "Pull 5 specific, concrete actions a husband and father should take this week."</w:t>
-      </w:r>
-    </w:p>
-    <w:p>
-      <w:pPr>
-        <w:pStyle w:val="ListParagraph"/>
-        <w:numPr>
-          <w:ilvl w:val="0"/>
-          <w:numId w:val="3"/>
-        </w:numPr>
-      </w:pPr>
-      <w:r>
-        <w:rPr>
-          <w:sz w:val="22"/>
-          <w:szCs w:val="22"/>
-        </w:rPr>
-        <w:t xml:space="preserve">Pick ONE. Do it today. Track the other 4.</w:t>
-      </w:r>
-    </w:p>
-    <w:p>
-      <w:pPr>
-        <w:spacing w:after="120"/>
-      </w:pPr>
-      <w:r>
-        <w:t xml:space="preserve"/>
-      </w:r>
-    </w:p>
-    <w:tbl>
-      <w:tblPr>
-        <w:tblW w:type="dxa" w:w="9360"/>
-        <w:tblBorders>
-          <w:top w:val="single" w:color="auto" w:sz="4"/>
-          <w:left w:val="single" w:color="auto" w:sz="4"/>
-          <w:bottom w:val="single" w:color="auto" w:sz="4"/>
-          <w:right w:val="single" w:color="auto" w:sz="4"/>
-          <w:insideH w:val="single" w:color="auto" w:sz="4"/>
-          <w:insideV w:val="single" w:color="auto" w:sz="4"/>
-        </w:tblBorders>
-      </w:tblPr>
-      <w:tblGrid>
-        <w:gridCol w:w="9360"/>
-      </w:tblGrid>
-      <w:tr>
-        <w:tc>
-          <w:tcPr>
-            <w:tcW w:type="dxa" w:w="9360"/>
-            <w:tcBorders>
-              <w:top w:val="single" w:color="D1D5DB" w:sz="4"/>
-              <w:left w:val="single" w:color="1E293B" w:sz="24"/>
-              <w:bottom w:val="single" w:color="D1D5DB" w:sz="4"/>
-              <w:right w:val="single" w:color="D1D5DB" w:sz="4"/>
-            </w:tcBorders>
-            <w:shd w:fill="F4F5F7" w:val="clear"/>
-            <w:tcMar>
-              <w:top w:type="dxa" w:w="160"/>
-              <w:left w:type="dxa" w:w="240"/>
-              <w:bottom w:type="dxa" w:w="160"/>
-              <w:right w:type="dxa" w:w="240"/>
-            </w:tcMar>
-          </w:tcPr>
-          <w:p>
-            <w:pPr>
-              <w:spacing w:after="60"/>
-            </w:pPr>
-            <w:r>
-              <w:rPr>
-                <w:b/>
-                <w:bCs/>
-                <w:color w:val="CE8E31"/>
-                <w:sz w:val="18"/>
-                <w:szCs w:val="18"/>
-              </w:rPr>
-              <w:t xml:space="preserve">IF YOU DON'T TAKE NOTES</w:t>
-            </w:r>
-          </w:p>
-          <w:p>
-            <w:r>
-              <w:rPr>
-                <w:sz w:val="22"/>
-                <w:szCs w:val="22"/>
-              </w:rPr>
-              <w:t xml:space="preserve">That's task 1.5: start Sunday. A captain who can't quote his pastor by Tuesday has wasted Sunday.</w:t>
-            </w:r>
-          </w:p>
-        </w:tc>
-      </w:tr>
-    </w:tbl>
-    <w:p>
-      <w:pPr>
-        <w:spacing w:after="120"/>
-      </w:pPr>
-      <w:r>
-        <w:t xml:space="preserve"/>
-      </w:r>
-    </w:p>
-    <w:p>
-      <w:pPr>
-        <w:pStyle w:val="Heading3"/>
-      </w:pPr>
-      <w:r>
-        <w:t xml:space="preserve">Scripture sit</w:t>
-      </w:r>
-    </w:p>
-    <w:p>
-      <w:pPr>
-        <w:spacing w:after="120"/>
-      </w:pPr>
-      <w:r>
-        <w:rPr>
-          <w:i/>
-          <w:iCs/>
-          <w:color w:val="1A1A1A"/>
-          <w:sz w:val="22"/>
-          <w:szCs w:val="22"/>
-        </w:rPr>
-        <w:t xml:space="preserve">James 1:22 — Be doers of the word, and not hearers only.</w:t>
-      </w:r>
-    </w:p>
-    <w:p>
-      <w:r>
-        <w:br w:type="page"/>
-      </w:r>
-    </w:p>
-    <w:p>
-      <w:pPr>
-        <w:spacing w:after="60"/>
-      </w:pPr>
-      <w:r>
-        <w:rPr>
-          <w:b/>
-          <w:bCs/>
-          <w:color w:val="CE8E31"/>
-          <w:sz w:val="18"/>
-          <w:szCs w:val="18"/>
-        </w:rPr>
-        <w:t xml:space="preserve">WEEK 4 · TASK 2</w:t>
-      </w:r>
-    </w:p>
-    <w:p>
-      <w:pPr>
-        <w:pStyle w:val="Heading2"/>
-      </w:pPr>
-      <w:r>
-        <w:t xml:space="preserve">10-Min Scripture Study, You Lead</w:t>
-      </w:r>
-    </w:p>
-    <w:p>
-      <w:pPr>
-        <w:spacing w:after="120"/>
-      </w:pPr>
-      <w:r>
-        <w:rPr>
-          <w:i/>
-          <w:iCs/>
-          <w:color w:val="475569"/>
-          <w:sz w:val="22"/>
-          <w:szCs w:val="22"/>
-        </w:rPr>
-        <w:t xml:space="preserve">Claude is a study partner. Not a commentary. Not a pastor.</w:t>
-      </w:r>
-    </w:p>
-    <w:p>
-      <w:pPr>
-        <w:pBdr>
-          <w:bottom w:val="single" w:color="CE8E31" w:sz="6" w:space="1"/>
-        </w:pBdr>
-        <w:spacing w:after="120"/>
-      </w:pPr>
-    </w:p>
-    <w:p>
-      <w:pPr>
-        <w:spacing w:after="120"/>
-      </w:pPr>
-      <w:r>
-        <w:rPr>
-          <w:color w:val="1A1A1A"/>
-          <w:sz w:val="22"/>
-          <w:szCs w:val="22"/>
-        </w:rPr>
-        <w:t xml:space="preserve">Most men outsource Bible study to a pastor. Flip that. You pick the passage.</w:t>
-      </w:r>
-    </w:p>
-    <w:p>
-      <w:pPr>
-        <w:pStyle w:val="Heading3"/>
-      </w:pPr>
-      <w:r>
-        <w:t xml:space="preserve">Action checklist</w:t>
-      </w:r>
-    </w:p>
-    <w:p>
-      <w:pPr>
-        <w:pStyle w:val="ListParagraph"/>
-        <w:numPr>
-          <w:ilvl w:val="0"/>
-          <w:numId w:val="3"/>
-        </w:numPr>
-      </w:pPr>
-      <w:r>
-        <w:rPr>
-          <w:sz w:val="22"/>
-          <w:szCs w:val="22"/>
-        </w:rPr>
-        <w:t xml:space="preserve">Pick a short passage. Read it aloud, slowly, twice. No screens.</w:t>
-      </w:r>
-    </w:p>
-    <w:p>
-      <w:pPr>
-        <w:pStyle w:val="ListParagraph"/>
-        <w:numPr>
-          <w:ilvl w:val="0"/>
-          <w:numId w:val="3"/>
-        </w:numPr>
-      </w:pPr>
-      <w:r>
-        <w:rPr>
-          <w:sz w:val="22"/>
-          <w:szCs w:val="22"/>
-        </w:rPr>
-        <w:t xml:space="preserve">Open Claude. Use it ONLY for context, cross-references, original-language word notes.</w:t>
-      </w:r>
-    </w:p>
-    <w:p>
-      <w:pPr>
-        <w:pStyle w:val="ListParagraph"/>
-        <w:numPr>
-          <w:ilvl w:val="0"/>
-          <w:numId w:val="3"/>
-        </w:numPr>
-      </w:pPr>
-      <w:r>
-        <w:rPr>
-          <w:sz w:val="22"/>
-          <w:szCs w:val="22"/>
-        </w:rPr>
-        <w:t xml:space="preserve">DO NOT ask Claude what it means for your life.</w:t>
-      </w:r>
-    </w:p>
-    <w:p>
-      <w:pPr>
-        <w:pStyle w:val="ListParagraph"/>
-        <w:numPr>
-          <w:ilvl w:val="0"/>
-          <w:numId w:val="3"/>
-        </w:numPr>
-      </w:pPr>
-      <w:r>
-        <w:rPr>
-          <w:sz w:val="22"/>
-          <w:szCs w:val="22"/>
-        </w:rPr>
-        <w:t xml:space="preserve">Write your own one-sentence application.</w:t>
-      </w:r>
-    </w:p>
-    <w:p>
-      <w:pPr>
-        <w:spacing w:after="120"/>
-      </w:pPr>
-      <w:r>
-        <w:t xml:space="preserve"/>
-      </w:r>
-    </w:p>
-    <w:tbl>
-      <w:tblPr>
-        <w:tblW w:type="dxa" w:w="9360"/>
-        <w:tblBorders>
-          <w:top w:val="single" w:color="auto" w:sz="4"/>
-          <w:left w:val="single" w:color="auto" w:sz="4"/>
-          <w:bottom w:val="single" w:color="auto" w:sz="4"/>
-          <w:right w:val="single" w:color="auto" w:sz="4"/>
-          <w:insideH w:val="single" w:color="auto" w:sz="4"/>
-          <w:insideV w:val="single" w:color="auto" w:sz="4"/>
-        </w:tblBorders>
-      </w:tblPr>
-      <w:tblGrid>
-        <w:gridCol w:w="9360"/>
-      </w:tblGrid>
-      <w:tr>
-        <w:tc>
-          <w:tcPr>
-            <w:tcW w:type="dxa" w:w="9360"/>
-            <w:tcBorders>
-              <w:top w:val="single" w:color="D1D5DB" w:sz="4"/>
-              <w:left w:val="single" w:color="1E293B" w:sz="24"/>
-              <w:bottom w:val="single" w:color="D1D5DB" w:sz="4"/>
-              <w:right w:val="single" w:color="D1D5DB" w:sz="4"/>
-            </w:tcBorders>
-            <w:shd w:fill="F4F5F7" w:val="clear"/>
-            <w:tcMar>
-              <w:top w:type="dxa" w:w="160"/>
-              <w:left w:type="dxa" w:w="240"/>
-              <w:bottom w:type="dxa" w:w="160"/>
-              <w:right w:type="dxa" w:w="240"/>
-            </w:tcMar>
-          </w:tcPr>
-          <w:p>
-            <w:pPr>
-              <w:spacing w:after="60"/>
-            </w:pPr>
-            <w:r>
-              <w:rPr>
-                <w:b/>
-                <w:bCs/>
-                <w:color w:val="CE8E31"/>
-                <w:sz w:val="18"/>
-                <w:szCs w:val="18"/>
-              </w:rPr>
-              <w:t xml:space="preserve">THE LINE</w:t>
-            </w:r>
-          </w:p>
-          <w:p>
-            <w:r>
-              <w:rPr>
-                <w:sz w:val="22"/>
-                <w:szCs w:val="22"/>
-              </w:rPr>
-              <w:t xml:space="preserve">AI is a research partner. The Spirit is the teacher. Confuse the two and you'll trade communion for content.</w:t>
-            </w:r>
-          </w:p>
-        </w:tc>
-      </w:tr>
-    </w:tbl>
-    <w:p>
-      <w:pPr>
-        <w:spacing w:after="120"/>
-      </w:pPr>
-      <w:r>
-        <w:t xml:space="preserve"/>
-      </w:r>
-    </w:p>
-    <w:p>
-      <w:pPr>
-        <w:pStyle w:val="Heading3"/>
-      </w:pPr>
-      <w:r>
-        <w:t xml:space="preserve">Scripture sit</w:t>
-      </w:r>
-    </w:p>
-    <w:p>
-      <w:pPr>
-        <w:spacing w:after="120"/>
-      </w:pPr>
-      <w:r>
-        <w:rPr>
-          <w:i/>
-          <w:iCs/>
-          <w:color w:val="1A1A1A"/>
-          <w:sz w:val="22"/>
-          <w:szCs w:val="22"/>
-        </w:rPr>
-        <w:t xml:space="preserve">Joshua 1:8 — Meditate on it day and night.</w:t>
-      </w:r>
-    </w:p>
-    <w:p>
-      <w:r>
-        <w:br w:type="page"/>
-      </w:r>
-    </w:p>
-    <w:p>
-      <w:pPr>
-        <w:spacing w:after="60"/>
-      </w:pPr>
-      <w:r>
-        <w:rPr>
-          <w:b/>
-          <w:bCs/>
-          <w:color w:val="CE8E31"/>
-          <w:sz w:val="18"/>
-          <w:szCs w:val="18"/>
-        </w:rPr>
-        <w:t xml:space="preserve">WEEK 4 · TASK 3</w:t>
-      </w:r>
-    </w:p>
-    <w:p>
-      <w:pPr>
-        <w:pStyle w:val="Heading2"/>
-      </w:pPr>
-      <w:r>
-        <w:t xml:space="preserve">Family Devotion Generator</w:t>
-      </w:r>
-    </w:p>
-    <w:p>
-      <w:pPr>
-        <w:spacing w:after="120"/>
-      </w:pPr>
-      <w:r>
-        <w:rPr>
-          <w:i/>
-          <w:iCs/>
-          <w:color w:val="475569"/>
-          <w:sz w:val="22"/>
-          <w:szCs w:val="22"/>
-        </w:rPr>
-        <w:t xml:space="preserve">Friday-night devo, built from Sunday's sermon. 10 minutes.</w:t>
-      </w:r>
-    </w:p>
-    <w:p>
-      <w:pPr>
-        <w:pBdr>
-          <w:bottom w:val="single" w:color="CE8E31" w:sz="6" w:space="1"/>
-        </w:pBdr>
-        <w:spacing w:after="120"/>
-      </w:pPr>
-    </w:p>
-    <w:p>
-      <w:pPr>
-        <w:spacing w:after="120"/>
-      </w:pPr>
-      <w:r>
-        <w:rPr>
-          <w:color w:val="1A1A1A"/>
-          <w:sz w:val="22"/>
-          <w:szCs w:val="22"/>
-        </w:rPr>
-        <w:t xml:space="preserve">Family devotion lives or dies on the captain's preparation.</w:t>
-      </w:r>
-    </w:p>
-    <w:p>
-      <w:pPr>
-        <w:pStyle w:val="Heading3"/>
-      </w:pPr>
-      <w:r>
-        <w:t xml:space="preserve">Action checklist</w:t>
-      </w:r>
-    </w:p>
-    <w:p>
-      <w:pPr>
-        <w:pStyle w:val="ListParagraph"/>
-        <w:numPr>
-          <w:ilvl w:val="0"/>
-          <w:numId w:val="3"/>
-        </w:numPr>
-      </w:pPr>
-      <w:r>
-        <w:rPr>
-          <w:sz w:val="22"/>
-          <w:szCs w:val="22"/>
-        </w:rPr>
-        <w:t xml:space="preserve">Paste this Sunday's sermon notes into Claude.</w:t>
-      </w:r>
-    </w:p>
-    <w:p>
-      <w:pPr>
-        <w:pStyle w:val="ListParagraph"/>
-        <w:numPr>
-          <w:ilvl w:val="0"/>
-          <w:numId w:val="3"/>
-        </w:numPr>
-      </w:pPr>
-      <w:r>
-        <w:rPr>
-          <w:sz w:val="22"/>
-          <w:szCs w:val="22"/>
-        </w:rPr>
-        <w:t xml:space="preserve">Ask for: one key verse to read aloud, one short illustration, one question per kid (by age), one prayer prompt.</w:t>
-      </w:r>
-    </w:p>
-    <w:p>
-      <w:pPr>
-        <w:pStyle w:val="ListParagraph"/>
-        <w:numPr>
-          <w:ilvl w:val="0"/>
-          <w:numId w:val="3"/>
-        </w:numPr>
-      </w:pPr>
-      <w:r>
-        <w:rPr>
-          <w:sz w:val="22"/>
-          <w:szCs w:val="22"/>
-        </w:rPr>
-        <w:t xml:space="preserve">Cut anything that doesn't sound like you.</w:t>
-      </w:r>
-    </w:p>
-    <w:p>
-      <w:pPr>
-        <w:pStyle w:val="ListParagraph"/>
-        <w:numPr>
-          <w:ilvl w:val="0"/>
-          <w:numId w:val="3"/>
-        </w:numPr>
-      </w:pPr>
-      <w:r>
-        <w:rPr>
-          <w:sz w:val="22"/>
-          <w:szCs w:val="22"/>
-        </w:rPr>
-        <w:t xml:space="preserve">Run it Friday night. Take notes on what worked.</w:t>
-      </w:r>
-    </w:p>
-    <w:p>
-      <w:pPr>
-        <w:pStyle w:val="Heading3"/>
-      </w:pPr>
-      <w:r>
-        <w:t xml:space="preserve">Scripture sit</w:t>
-      </w:r>
-    </w:p>
-    <w:p>
-      <w:pPr>
-        <w:spacing w:after="120"/>
-      </w:pPr>
-      <w:r>
-        <w:rPr>
-          <w:i/>
-          <w:iCs/>
-          <w:color w:val="1A1A1A"/>
-          <w:sz w:val="22"/>
-          <w:szCs w:val="22"/>
-        </w:rPr>
-        <w:t xml:space="preserve">Psalm 78:4 — Tell to the coming generation the glorious deeds of the LORD.</w:t>
-      </w:r>
-    </w:p>
-    <w:p>
-      <w:r>
-        <w:br w:type="page"/>
-      </w:r>
-    </w:p>
-    <w:p>
-      <w:pPr>
-        <w:spacing w:after="60"/>
-      </w:pPr>
-      <w:r>
-        <w:rPr>
-          <w:b/>
-          <w:bCs/>
-          <w:color w:val="CE8E31"/>
-          <w:sz w:val="18"/>
-          <w:szCs w:val="18"/>
-        </w:rPr>
-        <w:t xml:space="preserve">WEEK 5</w:t>
-      </w:r>
-    </w:p>
-    <w:p>
-      <w:pPr>
-        <w:pStyle w:val="Heading1"/>
-      </w:pPr>
-      <w:r>
-        <w:t xml:space="preserve">Body</w:t>
-      </w:r>
-    </w:p>
-    <w:p>
-      <w:pPr>
-        <w:spacing w:after="120"/>
-      </w:pPr>
-      <w:r>
-        <w:rPr>
-          <w:i/>
-          <w:iCs/>
-          <w:color w:val="475569"/>
-          <w:sz w:val="22"/>
-          <w:szCs w:val="22"/>
-        </w:rPr>
-        <w:t xml:space="preserve">Steward the temple. The captain trains the body that carries the load.</w:t>
-      </w:r>
-    </w:p>
-    <w:p>
-      <w:pPr>
-        <w:pBdr>
-          <w:bottom w:val="single" w:color="CE8E31" w:sz="6" w:space="1"/>
-        </w:pBdr>
-        <w:spacing w:after="120"/>
-      </w:pPr>
-    </w:p>
-    <w:p>
-      <w:pPr>
-        <w:spacing w:after="120"/>
-      </w:pPr>
-      <w:r>
-        <w:rPr>
-          <w:color w:val="1A1A1A"/>
-          <w:sz w:val="22"/>
-          <w:szCs w:val="22"/>
-        </w:rPr>
-        <w:t xml:space="preserve">Your body is the boat. If the captain can't carry his wife's groceries up two flights of stairs at 50, the family will know — not because she told them, but because they'll watch him fade. This week, the temple gets maintenance.</w:t>
-      </w:r>
-    </w:p>
-    <w:p>
-      <w:pPr>
-        <w:pStyle w:val="Heading3"/>
-      </w:pPr>
-      <w:r>
-        <w:t xml:space="preserve">Scripture anchor</w:t>
-      </w:r>
-    </w:p>
-    <w:p>
-      <w:pPr>
-        <w:spacing w:after="120"/>
-      </w:pPr>
-      <w:r>
-        <w:rPr>
-          <w:i/>
-          <w:iCs/>
-          <w:color w:val="1A1A1A"/>
-          <w:sz w:val="22"/>
-          <w:szCs w:val="22"/>
-        </w:rPr>
-        <w:t xml:space="preserve">"Your body is a temple of the Holy Spirit. Glorify God in your body."</w:t>
-      </w:r>
-    </w:p>
-    <w:p>
-      <w:pPr>
-        <w:spacing w:after="200"/>
-      </w:pPr>
-      <w:r>
-        <w:rPr>
-          <w:color w:val="6B7280"/>
-          <w:sz w:val="20"/>
-          <w:szCs w:val="20"/>
-        </w:rPr>
-        <w:t xml:space="preserve">— 1 Corinthians 6:19-20</w:t>
-      </w:r>
-    </w:p>
-    <w:p>
-      <w:r>
-        <w:br w:type="page"/>
-      </w:r>
-    </w:p>
-    <w:p>
-      <w:pPr>
-        <w:spacing w:after="60"/>
-      </w:pPr>
-      <w:r>
-        <w:rPr>
-          <w:b/>
-          <w:bCs/>
-          <w:color w:val="CE8E31"/>
-          <w:sz w:val="18"/>
-          <w:szCs w:val="18"/>
-        </w:rPr>
-        <w:t xml:space="preserve">WEEK 5 · TASK 1</w:t>
-      </w:r>
-    </w:p>
-    <w:p>
-      <w:pPr>
-        <w:pStyle w:val="Heading2"/>
-      </w:pPr>
-      <w:r>
-        <w:t xml:space="preserve">Weekly Movement Practice</w:t>
-      </w:r>
-    </w:p>
-    <w:p>
-      <w:pPr>
-        <w:spacing w:after="120"/>
-      </w:pPr>
-      <w:r>
-        <w:rPr>
-          <w:i/>
-          <w:iCs/>
-          <w:color w:val="475569"/>
-          <w:sz w:val="22"/>
-          <w:szCs w:val="22"/>
-        </w:rPr>
-        <w:t xml:space="preserve">3× strength + 2× walking. On the calendar. Not a wish.</w:t>
-      </w:r>
-    </w:p>
-    <w:p>
-      <w:pPr>
-        <w:pBdr>
-          <w:bottom w:val="single" w:color="CE8E31" w:sz="6" w:space="1"/>
-        </w:pBdr>
-        <w:spacing w:after="120"/>
-      </w:pPr>
-    </w:p>
-    <w:p>
-      <w:pPr>
-        <w:spacing w:after="120"/>
-      </w:pPr>
-      <w:r>
-        <w:rPr>
-          <w:color w:val="1A1A1A"/>
-          <w:sz w:val="22"/>
-          <w:szCs w:val="22"/>
-        </w:rPr>
-        <w:t xml:space="preserve">Your body is the boat. The bootcamp doesn't make you a different man if you can't carry your wife's groceries up two flights.</w:t>
-      </w:r>
-    </w:p>
-    <w:p>
-      <w:pPr>
-        <w:pStyle w:val="Heading3"/>
-      </w:pPr>
-      <w:r>
-        <w:t xml:space="preserve">Action checklist</w:t>
-      </w:r>
-    </w:p>
-    <w:p>
-      <w:pPr>
-        <w:pStyle w:val="ListParagraph"/>
-        <w:numPr>
-          <w:ilvl w:val="0"/>
-          <w:numId w:val="3"/>
-        </w:numPr>
-      </w:pPr>
-      <w:r>
-        <w:rPr>
-          <w:sz w:val="22"/>
-          <w:szCs w:val="22"/>
-        </w:rPr>
-        <w:t xml:space="preserve">Open Claude. Give your current state honestly. Note injuries.</w:t>
-      </w:r>
-    </w:p>
-    <w:p>
-      <w:pPr>
-        <w:pStyle w:val="ListParagraph"/>
-        <w:numPr>
-          <w:ilvl w:val="0"/>
-          <w:numId w:val="3"/>
-        </w:numPr>
-      </w:pPr>
-      <w:r>
-        <w:rPr>
-          <w:sz w:val="22"/>
-          <w:szCs w:val="22"/>
-        </w:rPr>
-        <w:t xml:space="preserve">Ask for a 4-week plan: 3 strength + 2 walking + 1 rest (Sabbath).</w:t>
-      </w:r>
-    </w:p>
-    <w:p>
-      <w:pPr>
-        <w:pStyle w:val="ListParagraph"/>
-        <w:numPr>
-          <w:ilvl w:val="0"/>
-          <w:numId w:val="3"/>
-        </w:numPr>
-      </w:pPr>
-      <w:r>
-        <w:rPr>
-          <w:sz w:val="22"/>
-          <w:szCs w:val="22"/>
-        </w:rPr>
-        <w:t xml:space="preserve">Put every session on the calendar THIS week.</w:t>
-      </w:r>
-    </w:p>
-    <w:p>
-      <w:pPr>
-        <w:pStyle w:val="ListParagraph"/>
-        <w:numPr>
-          <w:ilvl w:val="0"/>
-          <w:numId w:val="3"/>
-        </w:numPr>
-      </w:pPr>
-      <w:r>
-        <w:rPr>
-          <w:sz w:val="22"/>
-          <w:szCs w:val="22"/>
-        </w:rPr>
-        <w:t xml:space="preserve">Track it. Show up imperfectly.</w:t>
-      </w:r>
-    </w:p>
-    <w:p>
-      <w:pPr>
-        <w:spacing w:after="120"/>
-      </w:pPr>
-      <w:r>
-        <w:t xml:space="preserve"/>
-      </w:r>
-    </w:p>
-    <w:tbl>
-      <w:tblPr>
-        <w:tblW w:type="dxa" w:w="9360"/>
-        <w:tblBorders>
-          <w:top w:val="single" w:color="auto" w:sz="4"/>
-          <w:left w:val="single" w:color="auto" w:sz="4"/>
-          <w:bottom w:val="single" w:color="auto" w:sz="4"/>
-          <w:right w:val="single" w:color="auto" w:sz="4"/>
-          <w:insideH w:val="single" w:color="auto" w:sz="4"/>
-          <w:insideV w:val="single" w:color="auto" w:sz="4"/>
-        </w:tblBorders>
-      </w:tblPr>
-      <w:tblGrid>
-        <w:gridCol w:w="9360"/>
-      </w:tblGrid>
-      <w:tr>
-        <w:tc>
-          <w:tcPr>
-            <w:tcW w:type="dxa" w:w="9360"/>
-            <w:tcBorders>
-              <w:top w:val="single" w:color="D1D5DB" w:sz="4"/>
-              <w:left w:val="single" w:color="1E293B" w:sz="24"/>
-              <w:bottom w:val="single" w:color="D1D5DB" w:sz="4"/>
-              <w:right w:val="single" w:color="D1D5DB" w:sz="4"/>
-            </w:tcBorders>
-            <w:shd w:fill="F4F5F7" w:val="clear"/>
-            <w:tcMar>
-              <w:top w:type="dxa" w:w="160"/>
-              <w:left w:type="dxa" w:w="240"/>
-              <w:bottom w:type="dxa" w:w="160"/>
-              <w:right w:type="dxa" w:w="240"/>
-            </w:tcMar>
-          </w:tcPr>
-          <w:p>
-            <w:pPr>
-              <w:spacing w:after="60"/>
-            </w:pPr>
-            <w:r>
-              <w:rPr>
-                <w:b/>
-                <w:bCs/>
-                <w:color w:val="CE8E31"/>
-                <w:sz w:val="18"/>
-                <w:szCs w:val="18"/>
-              </w:rPr>
-              <w:t xml:space="preserve">IF YOU'RE A BEGINNER</w:t>
-            </w:r>
-          </w:p>
-          <w:p>
-            <w:r>
-              <w:rPr>
-                <w:sz w:val="22"/>
-                <w:szCs w:val="22"/>
-              </w:rPr>
-              <w:t xml:space="preserve">Start lower than you think. The win is 5 sessions this week. Not impressive numbers. Just reps.</w:t>
-            </w:r>
-          </w:p>
-        </w:tc>
-      </w:tr>
-    </w:tbl>
-    <w:p>
-      <w:pPr>
-        <w:spacing w:after="120"/>
-      </w:pPr>
-      <w:r>
-        <w:t xml:space="preserve"/>
-      </w:r>
-    </w:p>
-    <w:p>
-      <w:pPr>
-        <w:pStyle w:val="Heading3"/>
-      </w:pPr>
-      <w:r>
-        <w:t xml:space="preserve">Scripture sit</w:t>
-      </w:r>
-    </w:p>
-    <w:p>
-      <w:pPr>
-        <w:spacing w:after="120"/>
-      </w:pPr>
-      <w:r>
-        <w:rPr>
-          <w:i/>
-          <w:iCs/>
-          <w:color w:val="1A1A1A"/>
-          <w:sz w:val="22"/>
-          <w:szCs w:val="22"/>
-        </w:rPr>
-        <w:t xml:space="preserve">1 Corinthians 6:19-20 — Glorify God in your body.</w:t>
-      </w:r>
-    </w:p>
-    <w:p>
-      <w:r>
-        <w:br w:type="page"/>
-      </w:r>
-    </w:p>
-    <w:p>
-      <w:pPr>
-        <w:spacing w:after="60"/>
-      </w:pPr>
-      <w:r>
-        <w:rPr>
-          <w:b/>
-          <w:bCs/>
-          <w:color w:val="CE8E31"/>
-          <w:sz w:val="18"/>
-          <w:szCs w:val="18"/>
-        </w:rPr>
-        <w:t xml:space="preserve">WEEK 5 · TASK 2</w:t>
-      </w:r>
-    </w:p>
-    <w:p>
-      <w:pPr>
-        <w:pStyle w:val="Heading2"/>
-      </w:pPr>
-      <w:r>
-        <w:t xml:space="preserve">Captain's Meal Plan</w:t>
-      </w:r>
-    </w:p>
-    <w:p>
-      <w:pPr>
-        <w:spacing w:after="120"/>
-      </w:pPr>
-      <w:r>
-        <w:rPr>
-          <w:i/>
-          <w:iCs/>
-          <w:color w:val="475569"/>
-          <w:sz w:val="22"/>
-          <w:szCs w:val="22"/>
-        </w:rPr>
-        <w:t xml:space="preserve">Protein-forward one-week plan. AI drafts. Shopper collaborates.</w:t>
-      </w:r>
-    </w:p>
-    <w:p>
-      <w:pPr>
-        <w:pBdr>
-          <w:bottom w:val="single" w:color="CE8E31" w:sz="6" w:space="1"/>
-        </w:pBdr>
-        <w:spacing w:after="120"/>
-      </w:pPr>
-    </w:p>
-    <w:p>
-      <w:pPr>
-        <w:spacing w:after="120"/>
-      </w:pPr>
-      <w:r>
-        <w:rPr>
-          <w:color w:val="1A1A1A"/>
-          <w:sz w:val="22"/>
-          <w:szCs w:val="22"/>
-        </w:rPr>
-        <w:t xml:space="preserve">Most family captains lose this battle by 6pm because they didn't decide at 9am.</w:t>
-      </w:r>
-    </w:p>
-    <w:p>
-      <w:pPr>
-        <w:pStyle w:val="Heading3"/>
-      </w:pPr>
-      <w:r>
-        <w:t xml:space="preserve">Action checklist</w:t>
-      </w:r>
-    </w:p>
-    <w:p>
-      <w:pPr>
-        <w:pStyle w:val="ListParagraph"/>
-        <w:numPr>
-          <w:ilvl w:val="0"/>
-          <w:numId w:val="3"/>
-        </w:numPr>
-      </w:pPr>
-      <w:r>
-        <w:rPr>
-          <w:sz w:val="22"/>
-          <w:szCs w:val="22"/>
-        </w:rPr>
-        <w:t xml:space="preserve">Open Claude. Household details: kids' ages, allergies, budget.</w:t>
-      </w:r>
-    </w:p>
-    <w:p>
-      <w:pPr>
-        <w:pStyle w:val="ListParagraph"/>
-        <w:numPr>
-          <w:ilvl w:val="0"/>
-          <w:numId w:val="3"/>
-        </w:numPr>
-      </w:pPr>
-      <w:r>
-        <w:rPr>
-          <w:sz w:val="22"/>
-          <w:szCs w:val="22"/>
-        </w:rPr>
-        <w:t xml:space="preserve">Ask for 7 protein-forward dinners (~30 min prep) + grouped grocery list + 2 lunch defaults + 1 easy night.</w:t>
-      </w:r>
-    </w:p>
-    <w:p>
-      <w:pPr>
-        <w:pStyle w:val="ListParagraph"/>
-        <w:numPr>
-          <w:ilvl w:val="0"/>
-          <w:numId w:val="3"/>
-        </w:numPr>
-      </w:pPr>
-      <w:r>
-        <w:rPr>
-          <w:sz w:val="22"/>
-          <w:szCs w:val="22"/>
-        </w:rPr>
-        <w:t xml:space="preserve">Hand the draft to whoever shops. Collaborate.</w:t>
-      </w:r>
-    </w:p>
-    <w:p>
-      <w:pPr>
-        <w:pStyle w:val="ListParagraph"/>
-        <w:numPr>
-          <w:ilvl w:val="0"/>
-          <w:numId w:val="3"/>
-        </w:numPr>
-      </w:pPr>
-      <w:r>
-        <w:rPr>
-          <w:sz w:val="22"/>
-          <w:szCs w:val="22"/>
-        </w:rPr>
-        <w:t xml:space="preserve">Stock the pantry by Monday.</w:t>
-      </w:r>
-    </w:p>
-    <w:p>
-      <w:pPr>
-        <w:pStyle w:val="Heading3"/>
-      </w:pPr>
-      <w:r>
-        <w:t xml:space="preserve">Scripture sit</w:t>
-      </w:r>
-    </w:p>
-    <w:p>
-      <w:pPr>
-        <w:spacing w:after="120"/>
-      </w:pPr>
-      <w:r>
-        <w:rPr>
-          <w:i/>
-          <w:iCs/>
-          <w:color w:val="1A1A1A"/>
-          <w:sz w:val="22"/>
-          <w:szCs w:val="22"/>
-        </w:rPr>
-        <w:t xml:space="preserve">Proverbs 31:15 — A wise household plans meals.</w:t>
-      </w:r>
-    </w:p>
-    <w:p>
-      <w:r>
-        <w:br w:type="page"/>
-      </w:r>
-    </w:p>
-    <w:p>
-      <w:pPr>
-        <w:spacing w:after="60"/>
-      </w:pPr>
-      <w:r>
-        <w:rPr>
-          <w:b/>
-          <w:bCs/>
-          <w:color w:val="CE8E31"/>
-          <w:sz w:val="18"/>
-          <w:szCs w:val="18"/>
-        </w:rPr>
-        <w:t xml:space="preserve">WEEK 5 · TASK 3</w:t>
-      </w:r>
-    </w:p>
-    <w:p>
-      <w:pPr>
-        <w:pStyle w:val="Heading2"/>
-      </w:pPr>
-      <w:r>
-        <w:t xml:space="preserve">5-Night Sleep Audit</w:t>
-      </w:r>
-    </w:p>
-    <w:p>
-      <w:pPr>
-        <w:spacing w:after="120"/>
-      </w:pPr>
-      <w:r>
-        <w:rPr>
-          <w:i/>
-          <w:iCs/>
-          <w:color w:val="475569"/>
-          <w:sz w:val="22"/>
-          <w:szCs w:val="22"/>
-        </w:rPr>
-        <w:t xml:space="preserve">Log 5 nights. AI summarizes. Fix one variable next week.</w:t>
-      </w:r>
-    </w:p>
-    <w:p>
-      <w:pPr>
-        <w:pBdr>
-          <w:bottom w:val="single" w:color="CE8E31" w:sz="6" w:space="1"/>
-        </w:pBdr>
-        <w:spacing w:after="120"/>
-      </w:pPr>
-    </w:p>
-    <w:p>
-      <w:pPr>
-        <w:spacing w:after="120"/>
-      </w:pPr>
-      <w:r>
-        <w:rPr>
-          <w:color w:val="1A1A1A"/>
-          <w:sz w:val="22"/>
-          <w:szCs w:val="22"/>
-        </w:rPr>
-        <w:t xml:space="preserve">Sleep is leadership compounded. Diagnose by data, not by feeling.</w:t>
-      </w:r>
-    </w:p>
-    <w:p>
-      <w:pPr>
-        <w:pStyle w:val="Heading3"/>
-      </w:pPr>
-      <w:r>
-        <w:t xml:space="preserve">Action checklist</w:t>
-      </w:r>
-    </w:p>
-    <w:p>
-      <w:pPr>
-        <w:pStyle w:val="ListParagraph"/>
-        <w:numPr>
-          <w:ilvl w:val="0"/>
-          <w:numId w:val="3"/>
-        </w:numPr>
-      </w:pPr>
-      <w:r>
-        <w:rPr>
-          <w:sz w:val="22"/>
-          <w:szCs w:val="22"/>
-        </w:rPr>
-        <w:t xml:space="preserve">For 5 nights, log: bed time, wake time, caffeine cutoff, screen cutoff, stress 1-10, rested 1-10.</w:t>
-      </w:r>
-    </w:p>
-    <w:p>
-      <w:pPr>
-        <w:pStyle w:val="ListParagraph"/>
-        <w:numPr>
-          <w:ilvl w:val="0"/>
-          <w:numId w:val="3"/>
-        </w:numPr>
-      </w:pPr>
-      <w:r>
-        <w:rPr>
-          <w:sz w:val="22"/>
-          <w:szCs w:val="22"/>
-        </w:rPr>
-        <w:t xml:space="preserve">Saturday: paste all 5 nights into Claude. Ask for patterns and ONE variable to change.</w:t>
-      </w:r>
-    </w:p>
-    <w:p>
-      <w:pPr>
-        <w:pStyle w:val="ListParagraph"/>
-        <w:numPr>
-          <w:ilvl w:val="0"/>
-          <w:numId w:val="3"/>
-        </w:numPr>
-      </w:pPr>
-      <w:r>
-        <w:rPr>
-          <w:sz w:val="22"/>
-          <w:szCs w:val="22"/>
-        </w:rPr>
-        <w:t xml:space="preserve">Implement that one change next week. No others.</w:t>
-      </w:r>
-    </w:p>
-    <w:p>
-      <w:pPr>
-        <w:spacing w:after="120"/>
-      </w:pPr>
-      <w:r>
-        <w:t xml:space="preserve"/>
-      </w:r>
-    </w:p>
-    <w:tbl>
-      <w:tblPr>
-        <w:tblW w:type="dxa" w:w="9360"/>
-        <w:tblBorders>
-          <w:top w:val="single" w:color="auto" w:sz="4"/>
-          <w:left w:val="single" w:color="auto" w:sz="4"/>
-          <w:bottom w:val="single" w:color="auto" w:sz="4"/>
-          <w:right w:val="single" w:color="auto" w:sz="4"/>
-          <w:insideH w:val="single" w:color="auto" w:sz="4"/>
-          <w:insideV w:val="single" w:color="auto" w:sz="4"/>
-        </w:tblBorders>
-      </w:tblPr>
-      <w:tblGrid>
-        <w:gridCol w:w="9360"/>
-      </w:tblGrid>
-      <w:tr>
-        <w:tc>
-          <w:tcPr>
-            <w:tcW w:type="dxa" w:w="9360"/>
-            <w:tcBorders>
-              <w:top w:val="single" w:color="D1D5DB" w:sz="4"/>
-              <w:left w:val="single" w:color="1E293B" w:sz="24"/>
-              <w:bottom w:val="single" w:color="D1D5DB" w:sz="4"/>
-              <w:right w:val="single" w:color="D1D5DB" w:sz="4"/>
-            </w:tcBorders>
-            <w:shd w:fill="F4F5F7" w:val="clear"/>
-            <w:tcMar>
-              <w:top w:type="dxa" w:w="160"/>
-              <w:left w:type="dxa" w:w="240"/>
-              <w:bottom w:type="dxa" w:w="160"/>
-              <w:right w:type="dxa" w:w="240"/>
-            </w:tcMar>
-          </w:tcPr>
-          <w:p>
-            <w:pPr>
-              <w:spacing w:after="60"/>
-            </w:pPr>
-            <w:r>
-              <w:rPr>
-                <w:b/>
-                <w:bCs/>
-                <w:color w:val="CE8E31"/>
-                <w:sz w:val="18"/>
-                <w:szCs w:val="18"/>
-              </w:rPr>
-              <w:t xml:space="preserve">ONE VARIABLE</w:t>
-            </w:r>
-          </w:p>
-          <w:p>
-            <w:r>
-              <w:rPr>
-                <w:sz w:val="22"/>
-                <w:szCs w:val="22"/>
-              </w:rPr>
-              <w:t xml:space="preserve">Change five things at once and you'll know nothing. Change one and you'll know the truth in a week.</w:t>
-            </w:r>
-          </w:p>
-        </w:tc>
-      </w:tr>
-    </w:tbl>
-    <w:p>
-      <w:pPr>
-        <w:spacing w:after="120"/>
-      </w:pPr>
-      <w:r>
-        <w:t xml:space="preserve"/>
-      </w:r>
-    </w:p>
-    <w:p>
-      <w:pPr>
-        <w:pStyle w:val="Heading3"/>
-      </w:pPr>
-      <w:r>
-        <w:t xml:space="preserve">Scripture sit</w:t>
-      </w:r>
-    </w:p>
-    <w:p>
-      <w:pPr>
-        <w:spacing w:after="120"/>
-      </w:pPr>
-      <w:r>
-        <w:rPr>
-          <w:i/>
-          <w:iCs/>
-          <w:color w:val="1A1A1A"/>
-          <w:sz w:val="22"/>
-          <w:szCs w:val="22"/>
-        </w:rPr>
-        <w:t xml:space="preserve">Psalm 127:2 — He gives to his beloved sleep.</w:t>
-      </w:r>
-    </w:p>
-    <w:p>
-      <w:r>
-        <w:br w:type="page"/>
-      </w:r>
-    </w:p>
-    <w:p>
-      <w:pPr>
-        <w:spacing w:after="60"/>
-      </w:pPr>
-      <w:r>
-        <w:rPr>
-          <w:b/>
-          <w:bCs/>
-          <w:color w:val="CE8E31"/>
-          <w:sz w:val="18"/>
-          <w:szCs w:val="18"/>
-        </w:rPr>
-        <w:t xml:space="preserve">WEEK 6</w:t>
-      </w:r>
-    </w:p>
-    <w:p>
-      <w:pPr>
-        <w:pStyle w:val="Heading1"/>
-      </w:pPr>
-      <w:r>
-        <w:t xml:space="preserve">Finances</w:t>
+        <w:t xml:space="preserve">Finance</w:t>
       </w:r>
     </w:p>
     <w:p>
@@ -5797,7 +5797,7 @@
         <w:pStyle w:val="Heading3"/>
       </w:pPr>
       <w:r>
-        <w:t xml:space="preserve">Week 1 · Visioning</w:t>
+        <w:t xml:space="preserve">Week 1 · Vision</w:t>
       </w:r>
     </w:p>
     <w:p>
@@ -5917,7 +5917,7 @@
         <w:pStyle w:val="Heading3"/>
       </w:pPr>
       <w:r>
-        <w:t xml:space="preserve">Week 2 · Husbanding</w:t>
+        <w:t xml:space="preserve">Week 2 · Body</w:t>
       </w:r>
     </w:p>
     <w:p>
@@ -5933,6 +5933,246 @@
           <w:sz w:val="22"/>
           <w:szCs w:val="22"/>
         </w:rPr>
+        <w:t xml:space="preserve">Ask AI for 3× strength + 2× walking schedule. Put it on the calendar.</w:t>
+      </w:r>
+    </w:p>
+    <w:p>
+      <w:pPr>
+        <w:pStyle w:val="ListParagraph"/>
+        <w:numPr>
+          <w:ilvl w:val="0"/>
+          <w:numId w:val="4"/>
+        </w:numPr>
+      </w:pPr>
+      <w:r>
+        <w:rPr>
+          <w:sz w:val="22"/>
+          <w:szCs w:val="22"/>
+        </w:rPr>
+        <w:t xml:space="preserve">List yesterday's food. AI calculates protein. Adjust today by one meal.</w:t>
+      </w:r>
+    </w:p>
+    <w:p>
+      <w:pPr>
+        <w:pStyle w:val="ListParagraph"/>
+        <w:numPr>
+          <w:ilvl w:val="0"/>
+          <w:numId w:val="4"/>
+        </w:numPr>
+      </w:pPr>
+      <w:r>
+        <w:rPr>
+          <w:sz w:val="22"/>
+          <w:szCs w:val="22"/>
+        </w:rPr>
+        <w:t xml:space="preserve">Read 1 Cor 6:19-20. Ask Claude: "What does temple stewardship look like Monday morning?"</w:t>
+      </w:r>
+    </w:p>
+    <w:p>
+      <w:pPr>
+        <w:pStyle w:val="ListParagraph"/>
+        <w:numPr>
+          <w:ilvl w:val="0"/>
+          <w:numId w:val="4"/>
+        </w:numPr>
+      </w:pPr>
+      <w:r>
+        <w:rPr>
+          <w:sz w:val="22"/>
+          <w:szCs w:val="22"/>
+        </w:rPr>
+        <w:t xml:space="preserve">Pick ONE sleep variable (caffeine cutoff, screens, bedtime). AI helps you track 3 nights.</w:t>
+      </w:r>
+    </w:p>
+    <w:p>
+      <w:pPr>
+        <w:pStyle w:val="ListParagraph"/>
+        <w:numPr>
+          <w:ilvl w:val="0"/>
+          <w:numId w:val="4"/>
+        </w:numPr>
+      </w:pPr>
+      <w:r>
+        <w:rPr>
+          <w:sz w:val="22"/>
+          <w:szCs w:val="22"/>
+        </w:rPr>
+        <w:t xml:space="preserve">Take one call walking instead of sitting. Voice-memo what changed.</w:t>
+      </w:r>
+    </w:p>
+    <w:p>
+      <w:pPr>
+        <w:pStyle w:val="ListParagraph"/>
+        <w:numPr>
+          <w:ilvl w:val="0"/>
+          <w:numId w:val="4"/>
+        </w:numPr>
+      </w:pPr>
+      <w:r>
+        <w:rPr>
+          <w:sz w:val="22"/>
+          <w:szCs w:val="22"/>
+        </w:rPr>
+        <w:t xml:space="preserve">Voice-memo: "How am I treating my body this week?" Whisper. Read it. Adjust one thing.</w:t>
+      </w:r>
+    </w:p>
+    <w:p>
+      <w:pPr>
+        <w:pStyle w:val="ListParagraph"/>
+        <w:numPr>
+          <w:ilvl w:val="0"/>
+          <w:numId w:val="4"/>
+        </w:numPr>
+      </w:pPr>
+      <w:r>
+        <w:rPr>
+          <w:sz w:val="22"/>
+          <w:szCs w:val="22"/>
+        </w:rPr>
+        <w:t xml:space="preserve">Sabbath. Drill off.</w:t>
+      </w:r>
+    </w:p>
+    <w:p>
+      <w:pPr>
+        <w:pStyle w:val="Heading3"/>
+      </w:pPr>
+      <w:r>
+        <w:t xml:space="preserve">Week 3 · Spiritual</w:t>
+      </w:r>
+    </w:p>
+    <w:p>
+      <w:pPr>
+        <w:pStyle w:val="ListParagraph"/>
+        <w:numPr>
+          <w:ilvl w:val="0"/>
+          <w:numId w:val="4"/>
+        </w:numPr>
+      </w:pPr>
+      <w:r>
+        <w:rPr>
+          <w:sz w:val="22"/>
+          <w:szCs w:val="22"/>
+        </w:rPr>
+        <w:t xml:space="preserve">Read Joshua 1:8. Ask Claude: "When did I last meditate on Scripture day and night?" Be honest.</w:t>
+      </w:r>
+    </w:p>
+    <w:p>
+      <w:pPr>
+        <w:pStyle w:val="ListParagraph"/>
+        <w:numPr>
+          <w:ilvl w:val="0"/>
+          <w:numId w:val="4"/>
+        </w:numPr>
+      </w:pPr>
+      <w:r>
+        <w:rPr>
+          <w:sz w:val="22"/>
+          <w:szCs w:val="22"/>
+        </w:rPr>
+        <w:t xml:space="preserve">Before your next AI session, pray. Tell AI what you prayed. Notice what shifts.</w:t>
+      </w:r>
+    </w:p>
+    <w:p>
+      <w:pPr>
+        <w:pStyle w:val="ListParagraph"/>
+        <w:numPr>
+          <w:ilvl w:val="0"/>
+          <w:numId w:val="4"/>
+        </w:numPr>
+      </w:pPr>
+      <w:r>
+        <w:rPr>
+          <w:sz w:val="22"/>
+          <w:szCs w:val="22"/>
+        </w:rPr>
+        <w:t xml:space="preserve">Pick a verse. Hand-write it (no AI). Carry it in your pocket today.</w:t>
+      </w:r>
+    </w:p>
+    <w:p>
+      <w:pPr>
+        <w:pStyle w:val="ListParagraph"/>
+        <w:numPr>
+          <w:ilvl w:val="0"/>
+          <w:numId w:val="4"/>
+        </w:numPr>
+      </w:pPr>
+      <w:r>
+        <w:rPr>
+          <w:sz w:val="22"/>
+          <w:szCs w:val="22"/>
+        </w:rPr>
+        <w:t xml:space="preserve">Voice-memo one sin. Whisper it. AI summarizes. Confess to God. Delete the file.</w:t>
+      </w:r>
+    </w:p>
+    <w:p>
+      <w:pPr>
+        <w:pStyle w:val="ListParagraph"/>
+        <w:numPr>
+          <w:ilvl w:val="0"/>
+          <w:numId w:val="4"/>
+        </w:numPr>
+      </w:pPr>
+      <w:r>
+        <w:rPr>
+          <w:sz w:val="22"/>
+          <w:szCs w:val="22"/>
+        </w:rPr>
+        <w:t xml:space="preserve">10-min walk, no phone. Then voice-memo what God said. Whisper it. Read it tomorrow.</w:t>
+      </w:r>
+    </w:p>
+    <w:p>
+      <w:pPr>
+        <w:pStyle w:val="ListParagraph"/>
+        <w:numPr>
+          <w:ilvl w:val="0"/>
+          <w:numId w:val="4"/>
+        </w:numPr>
+      </w:pPr>
+      <w:r>
+        <w:rPr>
+          <w:sz w:val="22"/>
+          <w:szCs w:val="22"/>
+        </w:rPr>
+        <w:t xml:space="preserve">Take last Sunday's sermon. AI helps extract 5 actions. Do one today.</w:t>
+      </w:r>
+    </w:p>
+    <w:p>
+      <w:pPr>
+        <w:pStyle w:val="ListParagraph"/>
+        <w:numPr>
+          <w:ilvl w:val="0"/>
+          <w:numId w:val="4"/>
+        </w:numPr>
+      </w:pPr>
+      <w:r>
+        <w:rPr>
+          <w:sz w:val="22"/>
+          <w:szCs w:val="22"/>
+        </w:rPr>
+        <w:t xml:space="preserve">Sabbath. Drill off.</w:t>
+      </w:r>
+    </w:p>
+    <w:p>
+      <w:pPr>
+        <w:pStyle w:val="Heading3"/>
+      </w:pPr>
+      <w:r>
+        <w:t xml:space="preserve">Week 4 · Husbanding</w:t>
+      </w:r>
+    </w:p>
+    <w:p>
+      <w:pPr>
+        <w:pStyle w:val="ListParagraph"/>
+        <w:numPr>
+          <w:ilvl w:val="0"/>
+          <w:numId w:val="4"/>
+        </w:numPr>
+      </w:pPr>
+      <w:r>
+        <w:rPr>
+          <w:sz w:val="22"/>
+          <w:szCs w:val="22"/>
+        </w:rPr>
         <w:t xml:space="preserve">Send your wife one sentence of appreciation, drafted by you, polished by AI.</w:t>
       </w:r>
     </w:p>
@@ -6037,7 +6277,7 @@
         <w:pStyle w:val="Heading3"/>
       </w:pPr>
       <w:r>
-        <w:t xml:space="preserve">Week 3 · Fathering</w:t>
+        <w:t xml:space="preserve">Week 5 · Fathering</w:t>
       </w:r>
     </w:p>
     <w:p>
@@ -6157,247 +6397,7 @@
         <w:pStyle w:val="Heading3"/>
       </w:pPr>
       <w:r>
-        <w:t xml:space="preserve">Week 4 · Spiritual</w:t>
-      </w:r>
-    </w:p>
-    <w:p>
-      <w:pPr>
-        <w:pStyle w:val="ListParagraph"/>
-        <w:numPr>
-          <w:ilvl w:val="0"/>
-          <w:numId w:val="4"/>
-        </w:numPr>
-      </w:pPr>
-      <w:r>
-        <w:rPr>
-          <w:sz w:val="22"/>
-          <w:szCs w:val="22"/>
-        </w:rPr>
-        <w:t xml:space="preserve">Read Joshua 1:8. Ask Claude: "When did I last meditate on Scripture day and night?" Be honest.</w:t>
-      </w:r>
-    </w:p>
-    <w:p>
-      <w:pPr>
-        <w:pStyle w:val="ListParagraph"/>
-        <w:numPr>
-          <w:ilvl w:val="0"/>
-          <w:numId w:val="4"/>
-        </w:numPr>
-      </w:pPr>
-      <w:r>
-        <w:rPr>
-          <w:sz w:val="22"/>
-          <w:szCs w:val="22"/>
-        </w:rPr>
-        <w:t xml:space="preserve">Take last Sunday's sermon. AI helps extract 5 actions. Do one today.</w:t>
-      </w:r>
-    </w:p>
-    <w:p>
-      <w:pPr>
-        <w:pStyle w:val="ListParagraph"/>
-        <w:numPr>
-          <w:ilvl w:val="0"/>
-          <w:numId w:val="4"/>
-        </w:numPr>
-      </w:pPr>
-      <w:r>
-        <w:rPr>
-          <w:sz w:val="22"/>
-          <w:szCs w:val="22"/>
-        </w:rPr>
-        <w:t xml:space="preserve">Before your next AI session, pray. Tell AI what you prayed. Notice what shifts.</w:t>
-      </w:r>
-    </w:p>
-    <w:p>
-      <w:pPr>
-        <w:pStyle w:val="ListParagraph"/>
-        <w:numPr>
-          <w:ilvl w:val="0"/>
-          <w:numId w:val="4"/>
-        </w:numPr>
-      </w:pPr>
-      <w:r>
-        <w:rPr>
-          <w:sz w:val="22"/>
-          <w:szCs w:val="22"/>
-        </w:rPr>
-        <w:t xml:space="preserve">Pick a verse. Hand-write it (no AI). Carry it in your pocket today.</w:t>
-      </w:r>
-    </w:p>
-    <w:p>
-      <w:pPr>
-        <w:pStyle w:val="ListParagraph"/>
-        <w:numPr>
-          <w:ilvl w:val="0"/>
-          <w:numId w:val="4"/>
-        </w:numPr>
-      </w:pPr>
-      <w:r>
-        <w:rPr>
-          <w:sz w:val="22"/>
-          <w:szCs w:val="22"/>
-        </w:rPr>
-        <w:t xml:space="preserve">Voice-memo one sin. Whisper it. AI summarizes. Confess to God. Delete the file.</w:t>
-      </w:r>
-    </w:p>
-    <w:p>
-      <w:pPr>
-        <w:pStyle w:val="ListParagraph"/>
-        <w:numPr>
-          <w:ilvl w:val="0"/>
-          <w:numId w:val="4"/>
-        </w:numPr>
-      </w:pPr>
-      <w:r>
-        <w:rPr>
-          <w:sz w:val="22"/>
-          <w:szCs w:val="22"/>
-        </w:rPr>
-        <w:t xml:space="preserve">10-min walk, no phone. Then voice-memo what God said. Whisper it. Read it tomorrow.</w:t>
-      </w:r>
-    </w:p>
-    <w:p>
-      <w:pPr>
-        <w:pStyle w:val="ListParagraph"/>
-        <w:numPr>
-          <w:ilvl w:val="0"/>
-          <w:numId w:val="4"/>
-        </w:numPr>
-      </w:pPr>
-      <w:r>
-        <w:rPr>
-          <w:sz w:val="22"/>
-          <w:szCs w:val="22"/>
-        </w:rPr>
-        <w:t xml:space="preserve">Sabbath. Drill off.</w:t>
-      </w:r>
-    </w:p>
-    <w:p>
-      <w:pPr>
-        <w:pStyle w:val="Heading3"/>
-      </w:pPr>
-      <w:r>
-        <w:t xml:space="preserve">Week 5 · Body</w:t>
-      </w:r>
-    </w:p>
-    <w:p>
-      <w:pPr>
-        <w:pStyle w:val="ListParagraph"/>
-        <w:numPr>
-          <w:ilvl w:val="0"/>
-          <w:numId w:val="4"/>
-        </w:numPr>
-      </w:pPr>
-      <w:r>
-        <w:rPr>
-          <w:sz w:val="22"/>
-          <w:szCs w:val="22"/>
-        </w:rPr>
-        <w:t xml:space="preserve">Ask AI for 3× strength + 2× walking schedule. Put it on the calendar.</w:t>
-      </w:r>
-    </w:p>
-    <w:p>
-      <w:pPr>
-        <w:pStyle w:val="ListParagraph"/>
-        <w:numPr>
-          <w:ilvl w:val="0"/>
-          <w:numId w:val="4"/>
-        </w:numPr>
-      </w:pPr>
-      <w:r>
-        <w:rPr>
-          <w:sz w:val="22"/>
-          <w:szCs w:val="22"/>
-        </w:rPr>
-        <w:t xml:space="preserve">List yesterday's food. AI calculates protein. Adjust today by one meal.</w:t>
-      </w:r>
-    </w:p>
-    <w:p>
-      <w:pPr>
-        <w:pStyle w:val="ListParagraph"/>
-        <w:numPr>
-          <w:ilvl w:val="0"/>
-          <w:numId w:val="4"/>
-        </w:numPr>
-      </w:pPr>
-      <w:r>
-        <w:rPr>
-          <w:sz w:val="22"/>
-          <w:szCs w:val="22"/>
-        </w:rPr>
-        <w:t xml:space="preserve">Read 1 Cor 6:19-20. Ask Claude: "What does temple stewardship look like Monday morning?"</w:t>
-      </w:r>
-    </w:p>
-    <w:p>
-      <w:pPr>
-        <w:pStyle w:val="ListParagraph"/>
-        <w:numPr>
-          <w:ilvl w:val="0"/>
-          <w:numId w:val="4"/>
-        </w:numPr>
-      </w:pPr>
-      <w:r>
-        <w:rPr>
-          <w:sz w:val="22"/>
-          <w:szCs w:val="22"/>
-        </w:rPr>
-        <w:t xml:space="preserve">Pick ONE sleep variable (caffeine cutoff, screens, bedtime). AI helps you track 3 nights.</w:t>
-      </w:r>
-    </w:p>
-    <w:p>
-      <w:pPr>
-        <w:pStyle w:val="ListParagraph"/>
-        <w:numPr>
-          <w:ilvl w:val="0"/>
-          <w:numId w:val="4"/>
-        </w:numPr>
-      </w:pPr>
-      <w:r>
-        <w:rPr>
-          <w:sz w:val="22"/>
-          <w:szCs w:val="22"/>
-        </w:rPr>
-        <w:t xml:space="preserve">Take one call walking instead of sitting. Voice-memo what changed.</w:t>
-      </w:r>
-    </w:p>
-    <w:p>
-      <w:pPr>
-        <w:pStyle w:val="ListParagraph"/>
-        <w:numPr>
-          <w:ilvl w:val="0"/>
-          <w:numId w:val="4"/>
-        </w:numPr>
-      </w:pPr>
-      <w:r>
-        <w:rPr>
-          <w:sz w:val="22"/>
-          <w:szCs w:val="22"/>
-        </w:rPr>
-        <w:t xml:space="preserve">Voice-memo: "How am I treating my body this week?" Whisper. Read it. Adjust one thing.</w:t>
-      </w:r>
-    </w:p>
-    <w:p>
-      <w:pPr>
-        <w:pStyle w:val="ListParagraph"/>
-        <w:numPr>
-          <w:ilvl w:val="0"/>
-          <w:numId w:val="4"/>
-        </w:numPr>
-      </w:pPr>
-      <w:r>
-        <w:rPr>
-          <w:sz w:val="22"/>
-          <w:szCs w:val="22"/>
-        </w:rPr>
-        <w:t xml:space="preserve">Sabbath. Drill off.</w:t>
-      </w:r>
-    </w:p>
-    <w:p>
-      <w:pPr>
-        <w:pStyle w:val="Heading3"/>
-      </w:pPr>
-      <w:r>
-        <w:t xml:space="preserve">Week 6 · Finances</w:t>
+        <w:t xml:space="preserve">Week 6 · Finance</w:t>
       </w:r>
     </w:p>
     <w:p>

</xml_diff>

<commit_message>
FC Week-1 drills: swap 'Rewrite your worst prompt'->'Sharpen your best prompt' (build on the good); rework day-3 to 'Habakkuk 2:2 — ask God first' then refine with AI
Per MOOP: any prompt can be a good prompt (focus on the good), and God first before the AI tool. FC track only; USMC public drill list unchanged. Rebuilt web + Drills PDF + Master/Workbook .docx.

Co-Authored-By: Claude Opus 4.8 (1M context) <noreply@anthropic.com>
</commit_message>
<xml_diff>
--- a/downloads/family-captain/Family_Captain_Bootcamp_MASTER.docx
+++ b/downloads/family-captain/Family_Captain_Bootcamp_MASTER.docx
@@ -5829,7 +5829,7 @@
           <w:sz w:val="22"/>
           <w:szCs w:val="22"/>
         </w:rPr>
-        <w:t xml:space="preserve">Rewrite your worst prompt of last week — the one you're embarrassed about.</w:t>
+        <w:t xml:space="preserve">Take a prompt that worked this week and make it sharper — then save it so you can run it again.</w:t>
       </w:r>
     </w:p>
     <w:p>
@@ -5845,7 +5845,7 @@
           <w:sz w:val="22"/>
           <w:szCs w:val="22"/>
         </w:rPr>
-        <w:t xml:space="preserve">Read Habakkuk 2:2 aloud. Ask Claude to help you make your vision plain. Write it down.</w:t>
+        <w:t xml:space="preserve">Read Habakkuk 2:2 aloud. Ask God first to make your vision plain — sit with it in prayer. Then bring those thoughts to an AI to refine how and where to write it down.</w:t>
       </w:r>
     </w:p>
     <w:p>

</xml_diff>